<commit_message>
Add Online Retail SQL Analysis project, case study, and blog post
- Add a new data-analyst-tagged project: a normalized PostgreSQL
  schema (5 tables + staging) and 30 production SQL queries over
  500,000+ e-commerce transactions, automatically included in the
  Data Analyst resume and general resume/portfolio docs
- Add a branded thumbnail (code panel + KPI tiles + query results,
  matching the site's existing dashboard-mockup style)
- Add a case study covering the schema design, query techniques, key
  findings, and - as the differentiator - three real bugs found by
  auditing the query outputs themselves (a CURRENT_DATE recency bug
  that mislabeled 100% of customers "Inactive", a cohort query that
  only ever returned month zero, and an anomaly filter too permissive
  to be useful)
- Add a blog post built around that same auditing narrative
- Regenerated all resume/portfolio documents; verified all three
  resume variants still render at exactly 2 pages
</commit_message>
<xml_diff>
--- a/documents/Efe_Obukohwo_Portfolio.docx
+++ b/documents/Efe_Obukohwo_Portfolio.docx
@@ -1760,6 +1760,76 @@
           <w:rFonts w:ascii="Times New Roman" w:cs="Times New Roman" w:eastAsia="Times New Roman" w:hAnsi="Times New Roman"/>
         </w:rPr>
         <w:t xml:space="preserve">  Technologies: Java, Java Swing, PostgreSQL, JDBC, SHA-256, Web Server</w:t>
+      </w:r>
+    </w:p>
+    <w:p>
+      <w:pPr>
+        <w:spacing w:before="150"/>
+      </w:pPr>
+      <w:r>
+        <w:rPr>
+          <w:b/>
+          <w:bCs/>
+          <w:sz w:val="22"/>
+          <w:szCs w:val="22"/>
+          <w:rFonts w:ascii="Times New Roman" w:cs="Times New Roman" w:eastAsia="Times New Roman" w:hAnsi="Times New Roman"/>
+        </w:rPr>
+        <w:t xml:space="preserve">Online Retail SQL Analysis</w:t>
+      </w:r>
+      <w:r>
+        <w:rPr>
+          <w:i/>
+          <w:iCs/>
+          <w:sz w:val="20"/>
+          <w:szCs w:val="20"/>
+          <w:rFonts w:ascii="Times New Roman" w:cs="Times New Roman" w:eastAsia="Times New Roman" w:hAnsi="Times New Roman"/>
+        </w:rPr>
+        <w:t xml:space="preserve"> (Jul 2026)</w:t>
+      </w:r>
+    </w:p>
+    <w:p>
+      <w:pPr>
+        <w:spacing w:after="50"/>
+        <w:ind w:left="360"/>
+      </w:pPr>
+      <w:r>
+        <w:rPr>
+          <w:sz w:val="20"/>
+          <w:szCs w:val="20"/>
+          <w:rFonts w:ascii="Times New Roman" w:cs="Times New Roman" w:eastAsia="Times New Roman" w:hAnsi="Times New Roman"/>
+        </w:rPr>
+        <w:t xml:space="preserve">• Designed a normalized PostgreSQL database (5 tables + 1 staging table, 3NF, indexed foreign keys) for a 500,000+ row UK e-commerce transaction dataset, then wrote 30 production-ready SQL queries covering customer segmentation (RFM, LTV, cohort retention), product performance and cross-sell analysis, temporal trends, and anomaly detection using window functions (RANK, LAG, SUM OVER, NTILE, PERCENTILE_CONT), CTEs, and statistical aggregation. Surfaced that £8.91M in revenue from 4,339 customers is 82% UK-concentrated, that the top 10% of customers drive 61% of revenue, and that sub-£5 budget products generate 71% of revenue despite being a volume rather than margin business. Went further than reporting results: audited the query outputs themselves and documented real data-quality findings, including a CURRENT_DATE bug that silently mislabeled 100% of customers as "Inactive" and a cohort query that only ever returned month zero — the kind of self-auditing that separates production analysis from a one-off script.</w:t>
+      </w:r>
+    </w:p>
+    <w:p>
+      <w:pPr>
+        <w:spacing w:after="50"/>
+        <w:ind w:left="360"/>
+      </w:pPr>
+      <w:r>
+        <w:rPr>
+          <w:color w:val="0066CC"/>
+          <w:sz w:val="18"/>
+          <w:szCs w:val="18"/>
+          <w:rFonts w:ascii="Times New Roman" w:cs="Times New Roman" w:eastAsia="Times New Roman" w:hAnsi="Times New Roman"/>
+        </w:rPr>
+        <w:t xml:space="preserve">  GitHub: https://github.com/EfeObus/Online-Retail-SQL-Analysis</w:t>
+      </w:r>
+    </w:p>
+    <w:p>
+      <w:pPr>
+        <w:spacing w:after="100"/>
+        <w:ind w:left="360"/>
+      </w:pPr>
+      <w:r>
+        <w:rPr>
+          <w:i/>
+          <w:iCs/>
+          <w:sz w:val="18"/>
+          <w:szCs w:val="18"/>
+          <w:rFonts w:ascii="Times New Roman" w:cs="Times New Roman" w:eastAsia="Times New Roman" w:hAnsi="Times New Roman"/>
+        </w:rPr>
+        <w:t xml:space="preserve">  Technologies: PostgreSQL, SQL, Window Functions, CTEs, RFM Segmentation, Cohort Analysis, Database Design</w:t>
       </w:r>
     </w:p>
     <w:p>

</xml_diff>

<commit_message>
Fix project dates and remove overlapping IT Consultant role
- Correct 8 project dates to their real start dates (several personal
  projects go back to 2022-2024, not 2025-2026 as previously listed):
  VwaTek Apply, JTOV Network, WonderWorld Learning Adventure (now a
  completed 2023 project, not ongoing), Tekevwe LegalEagleAI, and
  TekVwarho Properties
- Remove the IT Consultant role (Finecare Diagnostic, Oct 2020-Oct
  2021) - it fully overlapped with the Compliance Officer role and
  overlapped ~11 months with IT Support Specialist, an unexplained
  double-full-time-job red flag on the resume
- Correct IT Support Specialist dates to Nov 2017 - Oct 2019 (was
  Nov 2018 - Oct 2020), which now transitions cleanly into Compliance
  Officer (Nov 2019) with no gap or overlap
- Regenerated all resume/portfolio documents; verified all three
  resume variants still render at exactly 2 pages and the experience
  timeline is now overlap-free
</commit_message>
<xml_diff>
--- a/documents/Efe_Obukohwo_Portfolio.docx
+++ b/documents/Efe_Obukohwo_Portfolio.docx
@@ -506,86 +506,6 @@
           <w:szCs w:val="22"/>
           <w:rFonts w:ascii="Times New Roman" w:cs="Times New Roman" w:eastAsia="Times New Roman" w:hAnsi="Times New Roman"/>
         </w:rPr>
-        <w:t xml:space="preserve">IT Consultant</w:t>
-      </w:r>
-      <w:r>
-        <w:rPr>
-          <w:sz w:val="22"/>
-          <w:szCs w:val="22"/>
-          <w:rFonts w:ascii="Times New Roman" w:cs="Times New Roman" w:eastAsia="Times New Roman" w:hAnsi="Times New Roman"/>
-        </w:rPr>
-        <w:t xml:space="preserve"> | Finecare Diagnostic Limited</w:t>
-      </w:r>
-    </w:p>
-    <w:p>
-      <w:pPr>
-        <w:spacing w:after="100"/>
-      </w:pPr>
-      <w:r>
-        <w:rPr>
-          <w:i/>
-          <w:iCs/>
-          <w:sz w:val="20"/>
-          <w:szCs w:val="20"/>
-          <w:rFonts w:ascii="Times New Roman" w:cs="Times New Roman" w:eastAsia="Times New Roman" w:hAnsi="Times New Roman"/>
-        </w:rPr>
-        <w:t xml:space="preserve">Sapele, Nigeria | Oct 2020 – Oct 2021</w:t>
-      </w:r>
-    </w:p>
-    <w:p>
-      <w:pPr>
-        <w:spacing w:after="50"/>
-        <w:ind w:left="360"/>
-      </w:pPr>
-      <w:r>
-        <w:rPr>
-          <w:sz w:val="20"/>
-          <w:szCs w:val="20"/>
-          <w:rFonts w:ascii="Times New Roman" w:cs="Times New Roman" w:eastAsia="Times New Roman" w:hAnsi="Times New Roman"/>
-        </w:rPr>
-        <w:t xml:space="preserve">• Devised and executed IT infrastructure solutions, including network setup and maintenance, boosting operational efficiency</w:t>
-      </w:r>
-    </w:p>
-    <w:p>
-      <w:pPr>
-        <w:spacing w:after="50"/>
-        <w:ind w:left="360"/>
-      </w:pPr>
-      <w:r>
-        <w:rPr>
-          <w:sz w:val="20"/>
-          <w:szCs w:val="20"/>
-          <w:rFonts w:ascii="Times New Roman" w:cs="Times New Roman" w:eastAsia="Times New Roman" w:hAnsi="Times New Roman"/>
-        </w:rPr>
-        <w:t xml:space="preserve">• Achieved a 65% increase in accounting accuracy by introducing invoicing software for receipts generation</w:t>
-      </w:r>
-    </w:p>
-    <w:p>
-      <w:pPr>
-        <w:spacing w:after="50"/>
-        <w:ind w:left="360"/>
-      </w:pPr>
-      <w:r>
-        <w:rPr>
-          <w:sz w:val="20"/>
-          <w:szCs w:val="20"/>
-          <w:rFonts w:ascii="Times New Roman" w:cs="Times New Roman" w:eastAsia="Times New Roman" w:hAnsi="Times New Roman"/>
-        </w:rPr>
-        <w:t xml:space="preserve">• Conducted market research and customer surveys to identify business expansion opportunities</w:t>
-      </w:r>
-    </w:p>
-    <w:p>
-      <w:pPr>
-        <w:spacing w:before="150"/>
-      </w:pPr>
-      <w:r>
-        <w:rPr>
-          <w:b/>
-          <w:bCs/>
-          <w:sz w:val="22"/>
-          <w:szCs w:val="22"/>
-          <w:rFonts w:ascii="Times New Roman" w:cs="Times New Roman" w:eastAsia="Times New Roman" w:hAnsi="Times New Roman"/>
-        </w:rPr>
         <w:t xml:space="preserve">IT Support Specialist</w:t>
       </w:r>
       <w:r>
@@ -609,7 +529,7 @@
           <w:szCs w:val="20"/>
           <w:rFonts w:ascii="Times New Roman" w:cs="Times New Roman" w:eastAsia="Times New Roman" w:hAnsi="Times New Roman"/>
         </w:rPr>
-        <w:t xml:space="preserve">Mosogar, Nigeria | Nov 2018 – Oct 2020</w:t>
+        <w:t xml:space="preserve">Mosogar, Nigeria | Nov 2017 – Oct 2019</w:t>
       </w:r>
     </w:p>
     <w:p>
@@ -944,7 +864,7 @@
           <w:szCs w:val="20"/>
           <w:rFonts w:ascii="Times New Roman" w:cs="Times New Roman" w:eastAsia="Times New Roman" w:hAnsi="Times New Roman"/>
         </w:rPr>
-        <w:t xml:space="preserve"> (Feb 2026 – Present)</w:t>
+        <w:t xml:space="preserve"> (Nov 2024 – Present)</w:t>
       </w:r>
     </w:p>
     <w:p>
@@ -1014,7 +934,7 @@
           <w:szCs w:val="20"/>
           <w:rFonts w:ascii="Times New Roman" w:cs="Times New Roman" w:eastAsia="Times New Roman" w:hAnsi="Times New Roman"/>
         </w:rPr>
-        <w:t xml:space="preserve"> (Jan 2026 – Present)</w:t>
+        <w:t xml:space="preserve"> (Jan 2024 – Present)</w:t>
       </w:r>
     </w:p>
     <w:p>
@@ -1154,6 +1074,76 @@
           <w:szCs w:val="20"/>
           <w:rFonts w:ascii="Times New Roman" w:cs="Times New Roman" w:eastAsia="Times New Roman" w:hAnsi="Times New Roman"/>
         </w:rPr>
+        <w:t xml:space="preserve"> (Jan 2023 – Nov 2023)</w:t>
+      </w:r>
+    </w:p>
+    <w:p>
+      <w:pPr>
+        <w:spacing w:after="50"/>
+        <w:ind w:left="360"/>
+      </w:pPr>
+      <w:r>
+        <w:rPr>
+          <w:sz w:val="20"/>
+          <w:szCs w:val="20"/>
+          <w:rFonts w:ascii="Times New Roman" w:cs="Times New Roman" w:eastAsia="Times New Roman" w:hAnsi="Times New Roman"/>
+        </w:rPr>
+        <w:t xml:space="preserve">• Research-driven adaptive early-childhood learning platform for ages 2–8, blending cognitive science, early-years pedagogy, and game design. Features a multi-domain curriculum covering literacy (letter formation, phonemic awareness, reading fluency), numeracy (subitizing, counting, early arithmetic), and social-emotional learning. Uses Item Response Theory (Rasch Model) for real-time personalization maintaining ~75% success probability. Includes multi-sensory SVG stroke tracing, on-device offline speech recognition, narrative game worlds with mascot-guided progression, and a parent dashboard with progress tracking. COPPA and GDPR-K compliant with offline-first architecture for low-connectivity environments. Achieves 60 FPS across mobile and web.</w:t>
+      </w:r>
+    </w:p>
+    <w:p>
+      <w:pPr>
+        <w:spacing w:after="50"/>
+        <w:ind w:left="360"/>
+      </w:pPr>
+      <w:r>
+        <w:rPr>
+          <w:color w:val="0066CC"/>
+          <w:sz w:val="18"/>
+          <w:szCs w:val="18"/>
+          <w:rFonts w:ascii="Times New Roman" w:cs="Times New Roman" w:eastAsia="Times New Roman" w:hAnsi="Times New Roman"/>
+        </w:rPr>
+        <w:t xml:space="preserve">  GitHub: https://github.com/EfeObus/WonderWorld-Learning-Adventure</w:t>
+      </w:r>
+    </w:p>
+    <w:p>
+      <w:pPr>
+        <w:spacing w:after="100"/>
+        <w:ind w:left="360"/>
+      </w:pPr>
+      <w:r>
+        <w:rPr>
+          <w:i/>
+          <w:iCs/>
+          <w:sz w:val="18"/>
+          <w:szCs w:val="18"/>
+          <w:rFonts w:ascii="Times New Roman" w:cs="Times New Roman" w:eastAsia="Times New Roman" w:hAnsi="Times New Roman"/>
+        </w:rPr>
+        <w:t xml:space="preserve">  Technologies: Flutter, Dart, Flame Engine, Python, FastAPI, PostgreSQL, Redis, NumPy, Speech-to-Text, Adaptive Learning</w:t>
+      </w:r>
+    </w:p>
+    <w:p>
+      <w:pPr>
+        <w:spacing w:before="150"/>
+      </w:pPr>
+      <w:r>
+        <w:rPr>
+          <w:b/>
+          <w:bCs/>
+          <w:sz w:val="22"/>
+          <w:szCs w:val="22"/>
+          <w:rFonts w:ascii="Times New Roman" w:cs="Times New Roman" w:eastAsia="Times New Roman" w:hAnsi="Times New Roman"/>
+        </w:rPr>
+        <w:t xml:space="preserve">TekVwa Life</w:t>
+      </w:r>
+      <w:r>
+        <w:rPr>
+          <w:i/>
+          <w:iCs/>
+          <w:sz w:val="20"/>
+          <w:szCs w:val="20"/>
+          <w:rFonts w:ascii="Times New Roman" w:cs="Times New Roman" w:eastAsia="Times New Roman" w:hAnsi="Times New Roman"/>
+        </w:rPr>
         <w:t xml:space="preserve"> (Dec 2025 – Present)</w:t>
       </w:r>
     </w:p>
@@ -1168,7 +1158,7 @@
           <w:szCs w:val="20"/>
           <w:rFonts w:ascii="Times New Roman" w:cs="Times New Roman" w:eastAsia="Times New Roman" w:hAnsi="Times New Roman"/>
         </w:rPr>
-        <w:t xml:space="preserve">• Research-driven adaptive early-childhood learning platform for ages 2–8, blending cognitive science, early-years pedagogy, and game design. Features a multi-domain curriculum covering literacy (letter formation, phonemic awareness, reading fluency), numeracy (subitizing, counting, early arithmetic), and social-emotional learning. Uses Item Response Theory (Rasch Model) for real-time personalization maintaining ~75% success probability. Includes multi-sensory SVG stroke tracing, on-device offline speech recognition, narrative game worlds with mascot-guided progression, and a parent dashboard with progress tracking. COPPA and GDPR-K compliant with offline-first architecture for low-connectivity environments. Achieves 60 FPS across mobile and web.</w:t>
+        <w:t xml:space="preserve">• Secure digital autobiography and legacy-preservation platform that enables users to write, organize, and protect their life stories using a professionally structured 28-chapter framework. TekVwa Life combines narrative creation, life-event and achievement tracking, and post-death legacy access into a single privacy-first system. Built with enterprise-grade security, Canadian data residency, and professional PDF/DOCX export, the platform transforms personal history into a permanent, transferable digital asset for families, historians, and estate planning purposes.</w:t>
       </w:r>
     </w:p>
     <w:p>
@@ -1183,23 +1173,23 @@
           <w:szCs w:val="18"/>
           <w:rFonts w:ascii="Times New Roman" w:cs="Times New Roman" w:eastAsia="Times New Roman" w:hAnsi="Times New Roman"/>
         </w:rPr>
-        <w:t xml:space="preserve">  GitHub: https://github.com/EfeObus/WonderWorld-Learning-Adventure</w:t>
-      </w:r>
-    </w:p>
-    <w:p>
-      <w:pPr>
-        <w:spacing w:after="100"/>
-        <w:ind w:left="360"/>
-      </w:pPr>
-      <w:r>
-        <w:rPr>
-          <w:i/>
-          <w:iCs/>
-          <w:sz w:val="18"/>
-          <w:szCs w:val="18"/>
-          <w:rFonts w:ascii="Times New Roman" w:cs="Times New Roman" w:eastAsia="Times New Roman" w:hAnsi="Times New Roman"/>
-        </w:rPr>
-        <w:t xml:space="preserve">  Technologies: Flutter, Dart, Flame Engine, Python, FastAPI, PostgreSQL, Redis, NumPy, Speech-to-Text, Adaptive Learning</w:t>
+        <w:t xml:space="preserve">  Live: https://tekvwa-life-production.up.railway.app/ | GitHub: https://github.com/EfeObus/TekVwa-Life</w:t>
+      </w:r>
+    </w:p>
+    <w:p>
+      <w:pPr>
+        <w:spacing w:after="100"/>
+        <w:ind w:left="360"/>
+      </w:pPr>
+      <w:r>
+        <w:rPr>
+          <w:i/>
+          <w:iCs/>
+          <w:sz w:val="18"/>
+          <w:szCs w:val="18"/>
+          <w:rFonts w:ascii="Times New Roman" w:cs="Times New Roman" w:eastAsia="Times New Roman" w:hAnsi="Times New Roman"/>
+        </w:rPr>
+        <w:t xml:space="preserve">  Technologies: Node.js, Express.js, PostgreSQL (AWS RDS), Prisma ORM, React, Material UI, JWT Authentication</w:t>
       </w:r>
     </w:p>
     <w:p>
@@ -1214,31 +1204,31 @@
           <w:szCs w:val="22"/>
           <w:rFonts w:ascii="Times New Roman" w:cs="Times New Roman" w:eastAsia="Times New Roman" w:hAnsi="Times New Roman"/>
         </w:rPr>
-        <w:t xml:space="preserve">TekVwa Life</w:t>
-      </w:r>
-      <w:r>
-        <w:rPr>
-          <w:i/>
-          <w:iCs/>
-          <w:sz w:val="20"/>
-          <w:szCs w:val="20"/>
-          <w:rFonts w:ascii="Times New Roman" w:cs="Times New Roman" w:eastAsia="Times New Roman" w:hAnsi="Times New Roman"/>
-        </w:rPr>
-        <w:t xml:space="preserve"> (Dec 2025 – Present)</w:t>
-      </w:r>
-    </w:p>
-    <w:p>
-      <w:pPr>
-        <w:spacing w:after="50"/>
-        <w:ind w:left="360"/>
-      </w:pPr>
-      <w:r>
-        <w:rPr>
-          <w:sz w:val="20"/>
-          <w:szCs w:val="20"/>
-          <w:rFonts w:ascii="Times New Roman" w:cs="Times New Roman" w:eastAsia="Times New Roman" w:hAnsi="Times New Roman"/>
-        </w:rPr>
-        <w:t xml:space="preserve">• Secure digital autobiography and legacy-preservation platform that enables users to write, organize, and protect their life stories using a professionally structured 28-chapter framework. TekVwa Life combines narrative creation, life-event and achievement tracking, and post-death legacy access into a single privacy-first system. Built with enterprise-grade security, Canadian data residency, and professional PDF/DOCX export, the platform transforms personal history into a permanent, transferable digital asset for families, historians, and estate planning purposes.</w:t>
+        <w:t xml:space="preserve">Tekvwa Analysis Platform</w:t>
+      </w:r>
+      <w:r>
+        <w:rPr>
+          <w:i/>
+          <w:iCs/>
+          <w:sz w:val="20"/>
+          <w:szCs w:val="20"/>
+          <w:rFonts w:ascii="Times New Roman" w:cs="Times New Roman" w:eastAsia="Times New Roman" w:hAnsi="Times New Roman"/>
+        </w:rPr>
+        <w:t xml:space="preserve"> (Jan 2025 – Present)</w:t>
+      </w:r>
+    </w:p>
+    <w:p>
+      <w:pPr>
+        <w:spacing w:after="50"/>
+        <w:ind w:left="360"/>
+      </w:pPr>
+      <w:r>
+        <w:rPr>
+          <w:sz w:val="20"/>
+          <w:szCs w:val="20"/>
+          <w:rFonts w:ascii="Times New Roman" w:cs="Times New Roman" w:eastAsia="Times New Roman" w:hAnsi="Times New Roman"/>
+        </w:rPr>
+        <w:t xml:space="preserve">• Tekvwa Analysis (v4.4.0, rebranded from TekVwarho Analysis) is a comprehensive statistical analysis platform with AI-powered reporting, migrated from Railway to Google Cloud Run (Cloud SQL, Secret Manager, Artifact Registry) with AI generation moved from the OpenAI API to Vertex AI (Gemini) authenticated via Application Default Credentials, eliminating any API key to store or rotate. Built around five core capabilities: an Excel-like data-entry grid for direct spreadsheet input, a deterministic auto-analysis engine that profiles uploaded data and recommends the statistically appropriate test with a plain-language rationale, plain-language interpretation panels (headline, key findings, caveats, glossary) on every one of 17 analysis pages, interactive drag/resize dashboards with per-chart pinning that persist per user, and AI reports that embed real chart images alongside Gemini-narrated analysis with a deterministic fallback so reports are never empty. Hardened app-wide login enforcement across every page and API call, and debugged a real data-type-detection bug that crashed the upload pipeline on fully-populated numeric columns, reproduced and fixed against a live 536,000-row dataset.</w:t>
       </w:r>
     </w:p>
     <w:p>
@@ -1253,23 +1243,23 @@
           <w:szCs w:val="18"/>
           <w:rFonts w:ascii="Times New Roman" w:cs="Times New Roman" w:eastAsia="Times New Roman" w:hAnsi="Times New Roman"/>
         </w:rPr>
-        <w:t xml:space="preserve">  Live: https://tekvwa-life-production.up.railway.app/ | GitHub: https://github.com/EfeObus/TekVwa-Life</w:t>
-      </w:r>
-    </w:p>
-    <w:p>
-      <w:pPr>
-        <w:spacing w:after="100"/>
-        <w:ind w:left="360"/>
-      </w:pPr>
-      <w:r>
-        <w:rPr>
-          <w:i/>
-          <w:iCs/>
-          <w:sz w:val="18"/>
-          <w:szCs w:val="18"/>
-          <w:rFonts w:ascii="Times New Roman" w:cs="Times New Roman" w:eastAsia="Times New Roman" w:hAnsi="Times New Roman"/>
-        </w:rPr>
-        <w:t xml:space="preserve">  Technologies: Node.js, Express.js, PostgreSQL (AWS RDS), Prisma ORM, React, Material UI, JWT Authentication</w:t>
+        <w:t xml:space="preserve">  Live: https://tekvwarho-analysis-551794668026.northamerica-northeast1.run.app/ | GitHub: https://github.com/EfeObus/TekVwarho-Analysis</w:t>
+      </w:r>
+    </w:p>
+    <w:p>
+      <w:pPr>
+        <w:spacing w:after="100"/>
+        <w:ind w:left="360"/>
+      </w:pPr>
+      <w:r>
+        <w:rPr>
+          <w:i/>
+          <w:iCs/>
+          <w:sz w:val="18"/>
+          <w:szCs w:val="18"/>
+          <w:rFonts w:ascii="Times New Roman" w:cs="Times New Roman" w:eastAsia="Times New Roman" w:hAnsi="Times New Roman"/>
+        </w:rPr>
+        <w:t xml:space="preserve">  Technologies: Flask, PostgreSQL, Google Cloud Run, Vertex AI (Gemini), Cloud SQL, Plotly.js, Bootstrap, Python</w:t>
       </w:r>
     </w:p>
     <w:p>
@@ -1284,31 +1274,31 @@
           <w:szCs w:val="22"/>
           <w:rFonts w:ascii="Times New Roman" w:cs="Times New Roman" w:eastAsia="Times New Roman" w:hAnsi="Times New Roman"/>
         </w:rPr>
-        <w:t xml:space="preserve">Tekvwa Analysis Platform</w:t>
-      </w:r>
-      <w:r>
-        <w:rPr>
-          <w:i/>
-          <w:iCs/>
-          <w:sz w:val="20"/>
-          <w:szCs w:val="20"/>
-          <w:rFonts w:ascii="Times New Roman" w:cs="Times New Roman" w:eastAsia="Times New Roman" w:hAnsi="Times New Roman"/>
-        </w:rPr>
-        <w:t xml:space="preserve"> (Jan 2025 – Present)</w:t>
-      </w:r>
-    </w:p>
-    <w:p>
-      <w:pPr>
-        <w:spacing w:after="50"/>
-        <w:ind w:left="360"/>
-      </w:pPr>
-      <w:r>
-        <w:rPr>
-          <w:sz w:val="20"/>
-          <w:szCs w:val="20"/>
-          <w:rFonts w:ascii="Times New Roman" w:cs="Times New Roman" w:eastAsia="Times New Roman" w:hAnsi="Times New Roman"/>
-        </w:rPr>
-        <w:t xml:space="preserve">• Tekvwa Analysis (v4.4.0, rebranded from TekVwarho Analysis) is a comprehensive statistical analysis platform with AI-powered reporting, migrated from Railway to Google Cloud Run (Cloud SQL, Secret Manager, Artifact Registry) with AI generation moved from the OpenAI API to Vertex AI (Gemini) authenticated via Application Default Credentials, eliminating any API key to store or rotate. Built around five core capabilities: an Excel-like data-entry grid for direct spreadsheet input, a deterministic auto-analysis engine that profiles uploaded data and recommends the statistically appropriate test with a plain-language rationale, plain-language interpretation panels (headline, key findings, caveats, glossary) on every one of 17 analysis pages, interactive drag/resize dashboards with per-chart pinning that persist per user, and AI reports that embed real chart images alongside Gemini-narrated analysis with a deterministic fallback so reports are never empty. Hardened app-wide login enforcement across every page and API call, and debugged a real data-type-detection bug that crashed the upload pipeline on fully-populated numeric columns, reproduced and fixed against a live 536,000-row dataset.</w:t>
+        <w:t xml:space="preserve">TK Reports - AI-Powered Data Analysis</w:t>
+      </w:r>
+      <w:r>
+        <w:rPr>
+          <w:i/>
+          <w:iCs/>
+          <w:sz w:val="20"/>
+          <w:szCs w:val="20"/>
+          <w:rFonts w:ascii="Times New Roman" w:cs="Times New Roman" w:eastAsia="Times New Roman" w:hAnsi="Times New Roman"/>
+        </w:rPr>
+        <w:t xml:space="preserve"> (Oct 2024)</w:t>
+      </w:r>
+    </w:p>
+    <w:p>
+      <w:pPr>
+        <w:spacing w:after="50"/>
+        <w:ind w:left="360"/>
+      </w:pPr>
+      <w:r>
+        <w:rPr>
+          <w:sz w:val="20"/>
+          <w:szCs w:val="20"/>
+          <w:rFonts w:ascii="Times New Roman" w:cs="Times New Roman" w:eastAsia="Times New Roman" w:hAnsi="Times New Roman"/>
+        </w:rPr>
+        <w:t xml:space="preserve">• Advanced AI-powered data analytics platform that transforms datasets into comprehensive, professional-grade analytical reports. Built with Flask and OpenAI GPT-4 Turbo, it combines statistical analysis (mean, median, mode, standard deviation, skewness, kurtosis, outlier detection), machine learning insights, correlation analysis, and natural language generation to produce executive-ready reports in DOCX and PDF formats. Features research objective-driven analysis, 5 professional visualizations with detailed interpretations, handles up to 100MB file uploads, supports CSV/XLSX/XLS/TSV formats, and delivers 15+ page comprehensive reports with AI-generated executive summaries, key findings, insights, and actionable recommendations.</w:t>
       </w:r>
     </w:p>
     <w:p>
@@ -1323,23 +1313,23 @@
           <w:szCs w:val="18"/>
           <w:rFonts w:ascii="Times New Roman" w:cs="Times New Roman" w:eastAsia="Times New Roman" w:hAnsi="Times New Roman"/>
         </w:rPr>
-        <w:t xml:space="preserve">  Live: https://tekvwarho-analysis-551794668026.northamerica-northeast1.run.app/ | GitHub: https://github.com/EfeObus/TekVwarho-Analysis</w:t>
-      </w:r>
-    </w:p>
-    <w:p>
-      <w:pPr>
-        <w:spacing w:after="100"/>
-        <w:ind w:left="360"/>
-      </w:pPr>
-      <w:r>
-        <w:rPr>
-          <w:i/>
-          <w:iCs/>
-          <w:sz w:val="18"/>
-          <w:szCs w:val="18"/>
-          <w:rFonts w:ascii="Times New Roman" w:cs="Times New Roman" w:eastAsia="Times New Roman" w:hAnsi="Times New Roman"/>
-        </w:rPr>
-        <w:t xml:space="preserve">  Technologies: Flask, PostgreSQL, Google Cloud Run, Vertex AI (Gemini), Cloud SQL, Plotly.js, Bootstrap, Python</w:t>
+        <w:t xml:space="preserve">  GitHub: https://github.com/EfeObus/TK-Reports</w:t>
+      </w:r>
+    </w:p>
+    <w:p>
+      <w:pPr>
+        <w:spacing w:after="100"/>
+        <w:ind w:left="360"/>
+      </w:pPr>
+      <w:r>
+        <w:rPr>
+          <w:i/>
+          <w:iCs/>
+          <w:sz w:val="18"/>
+          <w:szCs w:val="18"/>
+          <w:rFonts w:ascii="Times New Roman" w:cs="Times New Roman" w:eastAsia="Times New Roman" w:hAnsi="Times New Roman"/>
+        </w:rPr>
+        <w:t xml:space="preserve">  Technologies: Python, Flask, OpenAI GPT-4, Pandas, NumPy, SciPy, Matplotlib, Seaborn</w:t>
       </w:r>
     </w:p>
     <w:p>
@@ -1354,31 +1344,31 @@
           <w:szCs w:val="22"/>
           <w:rFonts w:ascii="Times New Roman" w:cs="Times New Roman" w:eastAsia="Times New Roman" w:hAnsi="Times New Roman"/>
         </w:rPr>
-        <w:t xml:space="preserve">TK Reports - AI-Powered Data Analysis</w:t>
-      </w:r>
-      <w:r>
-        <w:rPr>
-          <w:i/>
-          <w:iCs/>
-          <w:sz w:val="20"/>
-          <w:szCs w:val="20"/>
-          <w:rFonts w:ascii="Times New Roman" w:cs="Times New Roman" w:eastAsia="Times New Roman" w:hAnsi="Times New Roman"/>
-        </w:rPr>
-        <w:t xml:space="preserve"> (Oct 2024)</w:t>
-      </w:r>
-    </w:p>
-    <w:p>
-      <w:pPr>
-        <w:spacing w:after="50"/>
-        <w:ind w:left="360"/>
-      </w:pPr>
-      <w:r>
-        <w:rPr>
-          <w:sz w:val="20"/>
-          <w:szCs w:val="20"/>
-          <w:rFonts w:ascii="Times New Roman" w:cs="Times New Roman" w:eastAsia="Times New Roman" w:hAnsi="Times New Roman"/>
-        </w:rPr>
-        <w:t xml:space="preserve">• Advanced AI-powered data analytics platform that transforms datasets into comprehensive, professional-grade analytical reports. Built with Flask and OpenAI GPT-4 Turbo, it combines statistical analysis (mean, median, mode, standard deviation, skewness, kurtosis, outlier detection), machine learning insights, correlation analysis, and natural language generation to produce executive-ready reports in DOCX and PDF formats. Features research objective-driven analysis, 5 professional visualizations with detailed interpretations, handles up to 100MB file uploads, supports CSV/XLSX/XLS/TSV formats, and delivers 15+ page comprehensive reports with AI-generated executive summaries, key findings, insights, and actionable recommendations.</w:t>
+        <w:t xml:space="preserve">Zodiac Real Estate AI</w:t>
+      </w:r>
+      <w:r>
+        <w:rPr>
+          <w:i/>
+          <w:iCs/>
+          <w:sz w:val="20"/>
+          <w:szCs w:val="20"/>
+          <w:rFonts w:ascii="Times New Roman" w:cs="Times New Roman" w:eastAsia="Times New Roman" w:hAnsi="Times New Roman"/>
+        </w:rPr>
+        <w:t xml:space="preserve"> (May 2025 – Aug 2025)</w:t>
+      </w:r>
+    </w:p>
+    <w:p>
+      <w:pPr>
+        <w:spacing w:after="50"/>
+        <w:ind w:left="360"/>
+      </w:pPr>
+      <w:r>
+        <w:rPr>
+          <w:sz w:val="20"/>
+          <w:szCs w:val="20"/>
+          <w:rFonts w:ascii="Times New Roman" w:cs="Times New Roman" w:eastAsia="Times New Roman" w:hAnsi="Times New Roman"/>
+        </w:rPr>
+        <w:t xml:space="preserve">• Production-ready real estate analytics platform with 88.3% accuracy machine learning, combining real-time economic data for property valuations and market analysis across 49,551+ Canadian properties.</w:t>
       </w:r>
     </w:p>
     <w:p>
@@ -1393,23 +1383,23 @@
           <w:szCs w:val="18"/>
           <w:rFonts w:ascii="Times New Roman" w:cs="Times New Roman" w:eastAsia="Times New Roman" w:hAnsi="Times New Roman"/>
         </w:rPr>
-        <w:t xml:space="preserve">  GitHub: https://github.com/EfeObus/TK-Reports</w:t>
-      </w:r>
-    </w:p>
-    <w:p>
-      <w:pPr>
-        <w:spacing w:after="100"/>
-        <w:ind w:left="360"/>
-      </w:pPr>
-      <w:r>
-        <w:rPr>
-          <w:i/>
-          <w:iCs/>
-          <w:sz w:val="18"/>
-          <w:szCs w:val="18"/>
-          <w:rFonts w:ascii="Times New Roman" w:cs="Times New Roman" w:eastAsia="Times New Roman" w:hAnsi="Times New Roman"/>
-        </w:rPr>
-        <w:t xml:space="preserve">  Technologies: Python, Flask, OpenAI GPT-4, Pandas, NumPy, SciPy, Matplotlib, Seaborn</w:t>
+        <w:t xml:space="preserve">  GitHub: https://github.com/EfeObus/NextProperty</w:t>
+      </w:r>
+    </w:p>
+    <w:p>
+      <w:pPr>
+        <w:spacing w:after="100"/>
+        <w:ind w:left="360"/>
+      </w:pPr>
+      <w:r>
+        <w:rPr>
+          <w:i/>
+          <w:iCs/>
+          <w:sz w:val="18"/>
+          <w:szCs w:val="18"/>
+          <w:rFonts w:ascii="Times New Roman" w:cs="Times New Roman" w:eastAsia="Times New Roman" w:hAnsi="Times New Roman"/>
+        </w:rPr>
+        <w:t xml:space="preserve">  Technologies: Python, Flask, MySQL, Scikit-learn, XGBoost, Docker, JavaScript</w:t>
       </w:r>
     </w:p>
     <w:p>
@@ -1424,31 +1414,31 @@
           <w:szCs w:val="22"/>
           <w:rFonts w:ascii="Times New Roman" w:cs="Times New Roman" w:eastAsia="Times New Roman" w:hAnsi="Times New Roman"/>
         </w:rPr>
-        <w:t xml:space="preserve">Zodiac Real Estate AI</w:t>
-      </w:r>
-      <w:r>
-        <w:rPr>
-          <w:i/>
-          <w:iCs/>
-          <w:sz w:val="20"/>
-          <w:szCs w:val="20"/>
-          <w:rFonts w:ascii="Times New Roman" w:cs="Times New Roman" w:eastAsia="Times New Roman" w:hAnsi="Times New Roman"/>
-        </w:rPr>
-        <w:t xml:space="preserve"> (May 2025 – Aug 2025)</w:t>
-      </w:r>
-    </w:p>
-    <w:p>
-      <w:pPr>
-        <w:spacing w:after="50"/>
-        <w:ind w:left="360"/>
-      </w:pPr>
-      <w:r>
-        <w:rPr>
-          <w:sz w:val="20"/>
-          <w:szCs w:val="20"/>
-          <w:rFonts w:ascii="Times New Roman" w:cs="Times New Roman" w:eastAsia="Times New Roman" w:hAnsi="Times New Roman"/>
-        </w:rPr>
-        <w:t xml:space="preserve">• Production-ready real estate analytics platform with 88.3% accuracy machine learning, combining real-time economic data for property valuations and market analysis across 49,551+ Canadian properties.</w:t>
+        <w:t xml:space="preserve">IGNITE Sleep Lounge Automation</w:t>
+      </w:r>
+      <w:r>
+        <w:rPr>
+          <w:i/>
+          <w:iCs/>
+          <w:sz w:val="20"/>
+          <w:szCs w:val="20"/>
+          <w:rFonts w:ascii="Times New Roman" w:cs="Times New Roman" w:eastAsia="Times New Roman" w:hAnsi="Times New Roman"/>
+        </w:rPr>
+        <w:t xml:space="preserve"> (Sep 2024 – May 2025)</w:t>
+      </w:r>
+    </w:p>
+    <w:p>
+      <w:pPr>
+        <w:spacing w:after="50"/>
+        <w:ind w:left="360"/>
+      </w:pPr>
+      <w:r>
+        <w:rPr>
+          <w:sz w:val="20"/>
+          <w:szCs w:val="20"/>
+          <w:rFonts w:ascii="Times New Roman" w:cs="Times New Roman" w:eastAsia="Times New Roman" w:hAnsi="Times New Roman"/>
+        </w:rPr>
+        <w:t xml:space="preserve">• Digital check-in and waiver system for Humber College's IGNITE facilities, automating student registration, time tracking, and staff oversight with real-time functionality and admin dashboard.</w:t>
       </w:r>
     </w:p>
     <w:p>
@@ -1463,23 +1453,23 @@
           <w:szCs w:val="18"/>
           <w:rFonts w:ascii="Times New Roman" w:cs="Times New Roman" w:eastAsia="Times New Roman" w:hAnsi="Times New Roman"/>
         </w:rPr>
-        <w:t xml:space="preserve">  GitHub: https://github.com/EfeObus/NextProperty</w:t>
-      </w:r>
-    </w:p>
-    <w:p>
-      <w:pPr>
-        <w:spacing w:after="100"/>
-        <w:ind w:left="360"/>
-      </w:pPr>
-      <w:r>
-        <w:rPr>
-          <w:i/>
-          <w:iCs/>
-          <w:sz w:val="18"/>
-          <w:szCs w:val="18"/>
-          <w:rFonts w:ascii="Times New Roman" w:cs="Times New Roman" w:eastAsia="Times New Roman" w:hAnsi="Times New Roman"/>
-        </w:rPr>
-        <w:t xml:space="preserve">  Technologies: Python, Flask, MySQL, Scikit-learn, XGBoost, Docker, JavaScript</w:t>
+        <w:t xml:space="preserve">  GitHub: https://github.com/EfeObus/IGNITE-Sleep-Lounge-and-Zenzone</w:t>
+      </w:r>
+    </w:p>
+    <w:p>
+      <w:pPr>
+        <w:spacing w:after="100"/>
+        <w:ind w:left="360"/>
+      </w:pPr>
+      <w:r>
+        <w:rPr>
+          <w:i/>
+          <w:iCs/>
+          <w:sz w:val="18"/>
+          <w:szCs w:val="18"/>
+          <w:rFonts w:ascii="Times New Roman" w:cs="Times New Roman" w:eastAsia="Times New Roman" w:hAnsi="Times New Roman"/>
+        </w:rPr>
+        <w:t xml:space="preserve">  Technologies: Node.js, Express, PostgreSQL, JavaScript, JWT, HTML/CSS</w:t>
       </w:r>
     </w:p>
     <w:p>
@@ -1494,31 +1484,31 @@
           <w:szCs w:val="22"/>
           <w:rFonts w:ascii="Times New Roman" w:cs="Times New Roman" w:eastAsia="Times New Roman" w:hAnsi="Times New Roman"/>
         </w:rPr>
-        <w:t xml:space="preserve">IGNITE Sleep Lounge Automation</w:t>
-      </w:r>
-      <w:r>
-        <w:rPr>
-          <w:i/>
-          <w:iCs/>
-          <w:sz w:val="20"/>
-          <w:szCs w:val="20"/>
-          <w:rFonts w:ascii="Times New Roman" w:cs="Times New Roman" w:eastAsia="Times New Roman" w:hAnsi="Times New Roman"/>
-        </w:rPr>
-        <w:t xml:space="preserve"> (Sep 2024 – May 2025)</w:t>
-      </w:r>
-    </w:p>
-    <w:p>
-      <w:pPr>
-        <w:spacing w:after="50"/>
-        <w:ind w:left="360"/>
-      </w:pPr>
-      <w:r>
-        <w:rPr>
-          <w:sz w:val="20"/>
-          <w:szCs w:val="20"/>
-          <w:rFonts w:ascii="Times New Roman" w:cs="Times New Roman" w:eastAsia="Times New Roman" w:hAnsi="Times New Roman"/>
-        </w:rPr>
-        <w:t xml:space="preserve">• Digital check-in and waiver system for Humber College's IGNITE facilities, automating student registration, time tracking, and staff oversight with real-time functionality and admin dashboard.</w:t>
+        <w:t xml:space="preserve">Tekevwe LegalEagleAI</w:t>
+      </w:r>
+      <w:r>
+        <w:rPr>
+          <w:i/>
+          <w:iCs/>
+          <w:sz w:val="20"/>
+          <w:szCs w:val="20"/>
+          <w:rFonts w:ascii="Times New Roman" w:cs="Times New Roman" w:eastAsia="Times New Roman" w:hAnsi="Times New Roman"/>
+        </w:rPr>
+        <w:t xml:space="preserve"> (Nov 2022 – Present)</w:t>
+      </w:r>
+    </w:p>
+    <w:p>
+      <w:pPr>
+        <w:spacing w:after="50"/>
+        <w:ind w:left="360"/>
+      </w:pPr>
+      <w:r>
+        <w:rPr>
+          <w:sz w:val="20"/>
+          <w:szCs w:val="20"/>
+          <w:rFonts w:ascii="Times New Roman" w:cs="Times New Roman" w:eastAsia="Times New Roman" w:hAnsi="Times New Roman"/>
+        </w:rPr>
+        <w:t xml:space="preserve">• Web application designed to streamline legal document management and analysis. Provides features such as document generation, editing, and summarization, leveraging AI to assist users with legal research, contract creation, and risk analysis. The platform includes dashboards for activity tracking, quick actions, and recent documents, as well as collaboration tools with an AI chat assistant for insights and support.</w:t>
       </w:r>
     </w:p>
     <w:p>
@@ -1533,23 +1523,23 @@
           <w:szCs w:val="18"/>
           <w:rFonts w:ascii="Times New Roman" w:cs="Times New Roman" w:eastAsia="Times New Roman" w:hAnsi="Times New Roman"/>
         </w:rPr>
-        <w:t xml:space="preserve">  GitHub: https://github.com/EfeObus/IGNITE-Sleep-Lounge-and-Zenzone</w:t>
-      </w:r>
-    </w:p>
-    <w:p>
-      <w:pPr>
-        <w:spacing w:after="100"/>
-        <w:ind w:left="360"/>
-      </w:pPr>
-      <w:r>
-        <w:rPr>
-          <w:i/>
-          <w:iCs/>
-          <w:sz w:val="18"/>
-          <w:szCs w:val="18"/>
-          <w:rFonts w:ascii="Times New Roman" w:cs="Times New Roman" w:eastAsia="Times New Roman" w:hAnsi="Times New Roman"/>
-        </w:rPr>
-        <w:t xml:space="preserve">  Technologies: Node.js, Express, PostgreSQL, JavaScript, JWT, HTML/CSS</w:t>
+        <w:t xml:space="preserve">  GitHub: https://github.com/EfeObus/LegalEagleAI</w:t>
+      </w:r>
+    </w:p>
+    <w:p>
+      <w:pPr>
+        <w:spacing w:after="100"/>
+        <w:ind w:left="360"/>
+      </w:pPr>
+      <w:r>
+        <w:rPr>
+          <w:i/>
+          <w:iCs/>
+          <w:sz w:val="18"/>
+          <w:szCs w:val="18"/>
+          <w:rFonts w:ascii="Times New Roman" w:cs="Times New Roman" w:eastAsia="Times New Roman" w:hAnsi="Times New Roman"/>
+        </w:rPr>
+        <w:t xml:space="preserve">  Technologies: React, TypeScript, Vite, Tailwind CSS, Node.js, PostgreSQL, OpenAI API, Drizzle ORM</w:t>
       </w:r>
     </w:p>
     <w:p>
@@ -1564,76 +1554,6 @@
           <w:szCs w:val="22"/>
           <w:rFonts w:ascii="Times New Roman" w:cs="Times New Roman" w:eastAsia="Times New Roman" w:hAnsi="Times New Roman"/>
         </w:rPr>
-        <w:t xml:space="preserve">Tekevwe LegalEagleAI</w:t>
-      </w:r>
-      <w:r>
-        <w:rPr>
-          <w:i/>
-          <w:iCs/>
-          <w:sz w:val="20"/>
-          <w:szCs w:val="20"/>
-          <w:rFonts w:ascii="Times New Roman" w:cs="Times New Roman" w:eastAsia="Times New Roman" w:hAnsi="Times New Roman"/>
-        </w:rPr>
-        <w:t xml:space="preserve"> (Oct 2024 – Present)</w:t>
-      </w:r>
-    </w:p>
-    <w:p>
-      <w:pPr>
-        <w:spacing w:after="50"/>
-        <w:ind w:left="360"/>
-      </w:pPr>
-      <w:r>
-        <w:rPr>
-          <w:sz w:val="20"/>
-          <w:szCs w:val="20"/>
-          <w:rFonts w:ascii="Times New Roman" w:cs="Times New Roman" w:eastAsia="Times New Roman" w:hAnsi="Times New Roman"/>
-        </w:rPr>
-        <w:t xml:space="preserve">• Web application designed to streamline legal document management and analysis. Provides features such as document generation, editing, and summarization, leveraging AI to assist users with legal research, contract creation, and risk analysis. The platform includes dashboards for activity tracking, quick actions, and recent documents, as well as collaboration tools with an AI chat assistant for insights and support.</w:t>
-      </w:r>
-    </w:p>
-    <w:p>
-      <w:pPr>
-        <w:spacing w:after="50"/>
-        <w:ind w:left="360"/>
-      </w:pPr>
-      <w:r>
-        <w:rPr>
-          <w:color w:val="0066CC"/>
-          <w:sz w:val="18"/>
-          <w:szCs w:val="18"/>
-          <w:rFonts w:ascii="Times New Roman" w:cs="Times New Roman" w:eastAsia="Times New Roman" w:hAnsi="Times New Roman"/>
-        </w:rPr>
-        <w:t xml:space="preserve">  GitHub: https://github.com/EfeObus/LegalEagleAI</w:t>
-      </w:r>
-    </w:p>
-    <w:p>
-      <w:pPr>
-        <w:spacing w:after="100"/>
-        <w:ind w:left="360"/>
-      </w:pPr>
-      <w:r>
-        <w:rPr>
-          <w:i/>
-          <w:iCs/>
-          <w:sz w:val="18"/>
-          <w:szCs w:val="18"/>
-          <w:rFonts w:ascii="Times New Roman" w:cs="Times New Roman" w:eastAsia="Times New Roman" w:hAnsi="Times New Roman"/>
-        </w:rPr>
-        <w:t xml:space="preserve">  Technologies: React, TypeScript, Vite, Tailwind CSS, Node.js, PostgreSQL, OpenAI API, Drizzle ORM</w:t>
-      </w:r>
-    </w:p>
-    <w:p>
-      <w:pPr>
-        <w:spacing w:before="150"/>
-      </w:pPr>
-      <w:r>
-        <w:rPr>
-          <w:b/>
-          <w:bCs/>
-          <w:sz w:val="22"/>
-          <w:szCs w:val="22"/>
-          <w:rFonts w:ascii="Times New Roman" w:cs="Times New Roman" w:eastAsia="Times New Roman" w:hAnsi="Times New Roman"/>
-        </w:rPr>
         <w:t xml:space="preserve">TekVwarho Properties</w:t>
       </w:r>
       <w:r>
@@ -1644,7 +1564,7 @@
           <w:szCs w:val="20"/>
           <w:rFonts w:ascii="Times New Roman" w:cs="Times New Roman" w:eastAsia="Times New Roman" w:hAnsi="Times New Roman"/>
         </w:rPr>
-        <w:t xml:space="preserve"> (Feb 2025 – Present)</w:t>
+        <w:t xml:space="preserve"> (Feb 2022 – Present)</w:t>
       </w:r>
     </w:p>
     <w:p>

</xml_diff>

<commit_message>
Tailor resume experience sections by relevance; strengthen teaching bullets
- Tag every experience entry with relevantTo, and filter each tailored
  resume's Professional Experience to only relevant roles (Data Analyst,
  Developer, Teacher), instead of showing the full 9-job history on every
  variant. The general resume and Portfolio doc keep the complete list.
- Split the three teaching-role bullets into 2 bullets each with distinct
  action verbs and quantified outcomes, so they read as fully as the rest
  of the experience section instead of a single compound line
- Correct Data Processing Teacher to Full-time (was mislabeled Part-time)

Co-Authored-By: Claude Sonnet 5 <noreply@anthropic.com>
</commit_message>
<xml_diff>
--- a/documents/Efe_Obukohwo_Portfolio.docx
+++ b/documents/Efe_Obukohwo_Portfolio.docx
@@ -529,7 +529,21 @@
           <w:szCs w:val="20"/>
           <w:rFonts w:ascii="Times New Roman" w:cs="Times New Roman" w:eastAsia="Times New Roman" w:hAnsi="Times New Roman"/>
         </w:rPr>
-        <w:t xml:space="preserve">• Led a departmental initiative to digitize lesson-plan creation and approval via the school website, increasing teacher collaboration and efficiency by 50%</w:t>
+        <w:t xml:space="preserve">• Led a departmental initiative to digitize lesson-plan creation and approval through the school website, replacing a fully manual, paper-based process</w:t>
+      </w:r>
+    </w:p>
+    <w:p>
+      <w:pPr>
+        <w:spacing w:after="50"/>
+        <w:ind w:left="360"/>
+      </w:pPr>
+      <w:r>
+        <w:rPr>
+          <w:sz w:val="20"/>
+          <w:szCs w:val="20"/>
+          <w:rFonts w:ascii="Times New Roman" w:cs="Times New Roman" w:eastAsia="Times New Roman" w:hAnsi="Times New Roman"/>
+        </w:rPr>
+        <w:t xml:space="preserve">• Streamlined lesson-plan review and approval turnaround for the department, increasing teacher collaboration and operational efficiency by 50%</w:t>
       </w:r>
     </w:p>
     <w:p>
@@ -661,21 +675,35 @@
           <w:szCs w:val="20"/>
           <w:rFonts w:ascii="Times New Roman" w:cs="Times New Roman" w:eastAsia="Times New Roman" w:hAnsi="Times New Roman"/>
         </w:rPr>
-        <w:t xml:space="preserve">Oghara, Delta State, Nigeria | Sep 2019 – Aug 2021 (Part-time)</w:t>
-      </w:r>
-    </w:p>
-    <w:p>
-      <w:pPr>
-        <w:spacing w:after="50"/>
-        <w:ind w:left="360"/>
-      </w:pPr>
-      <w:r>
-        <w:rPr>
-          <w:sz w:val="20"/>
-          <w:szCs w:val="20"/>
-          <w:rFonts w:ascii="Times New Roman" w:cs="Times New Roman" w:eastAsia="Times New Roman" w:hAnsi="Times New Roman"/>
-        </w:rPr>
-        <w:t xml:space="preserve">• Pioneered the school's transition from manual to digital result computation, improving accuracy and cutting processing time by 75%, while applying data-driven teaching strategies that lifted average student grades by 20%</w:t>
+        <w:t xml:space="preserve">Oghara, Delta State, Nigeria | Sep 2019 – Aug 2021 (Full-time)</w:t>
+      </w:r>
+    </w:p>
+    <w:p>
+      <w:pPr>
+        <w:spacing w:after="50"/>
+        <w:ind w:left="360"/>
+      </w:pPr>
+      <w:r>
+        <w:rPr>
+          <w:sz w:val="20"/>
+          <w:szCs w:val="20"/>
+          <w:rFonts w:ascii="Times New Roman" w:cs="Times New Roman" w:eastAsia="Times New Roman" w:hAnsi="Times New Roman"/>
+        </w:rPr>
+        <w:t xml:space="preserve">• Pioneered the school's transition from manual to digital result computation, improving grading accuracy and cutting processing time by 75%</w:t>
+      </w:r>
+    </w:p>
+    <w:p>
+      <w:pPr>
+        <w:spacing w:after="50"/>
+        <w:ind w:left="360"/>
+      </w:pPr>
+      <w:r>
+        <w:rPr>
+          <w:sz w:val="20"/>
+          <w:szCs w:val="20"/>
+          <w:rFonts w:ascii="Times New Roman" w:cs="Times New Roman" w:eastAsia="Times New Roman" w:hAnsi="Times New Roman"/>
+        </w:rPr>
+        <w:t xml:space="preserve">• Applied data-driven teaching strategies informed by student performance trends, lifting average student grades by 20%</w:t>
       </w:r>
     </w:p>
     <w:p>
@@ -807,7 +835,21 @@
           <w:szCs w:val="20"/>
           <w:rFonts w:ascii="Times New Roman" w:cs="Times New Roman" w:eastAsia="Times New Roman" w:hAnsi="Times New Roman"/>
         </w:rPr>
-        <w:t xml:space="preserve">• Designed a project-based computer science curriculum aligned with industry trends, driving a 30% increase in STEM extracurricular enrollment, and coached the school's coding team to a first-place regional competition win</w:t>
+        <w:t xml:space="preserve">• Designed and delivered a project-based computer science curriculum aligned with industry trends, driving a 30% increase in STEM extracurricular enrollment</w:t>
+      </w:r>
+    </w:p>
+    <w:p>
+      <w:pPr>
+        <w:spacing w:after="50"/>
+        <w:ind w:left="360"/>
+      </w:pPr>
+      <w:r>
+        <w:rPr>
+          <w:sz w:val="20"/>
+          <w:szCs w:val="20"/>
+          <w:rFonts w:ascii="Times New Roman" w:cs="Times New Roman" w:eastAsia="Times New Roman" w:hAnsi="Times New Roman"/>
+        </w:rPr>
+        <w:t xml:space="preserve">• Coached the school's coding team through a competitive programming curriculum, leading them to a first-place win at a regional competition</w:t>
       </w:r>
     </w:p>
     <w:p>

</xml_diff>

<commit_message>
Strengthen resume bullets and summaries; add verified honours
- Rewrite all 26 experience bullets for clarity and impact; roles, titles,
  dates, bullet counts and every number are unchanged
- Tighten the Data Analyst, Developer and Teacher summaries
- Zodiac: "led a team of 5 interns" (confirmed), replacing "5 developers"
  on the resumes, experience page and case study
- Education: Humber ITS graduated with Honours; DELSU Second Class Upper
  Division (both verified against the original certificates)
- Regenerate all resume and portfolio DOCX/PDF downloads

Co-Authored-By: Claude Opus 5.5 <noreply@anthropic.com>
</commit_message>
<xml_diff>
--- a/documents/Efe_Obukohwo_Portfolio.docx
+++ b/documents/Efe_Obukohwo_Portfolio.docx
@@ -151,7 +151,7 @@
           <w:szCs w:val="22"/>
           <w:rFonts w:ascii="Calibri" w:cs="Calibri" w:eastAsia="Calibri" w:hAnsi="Calibri"/>
         </w:rPr>
-        <w:t xml:space="preserve">Data Analyst with hands-on experience turning messy, high-volume datasets into stakeholder-ready business intelligence using advanced Excel, SQL, and Python. Engineered a 56,636-row municipal housing dataset into a verified $18.50B market analysis with a dynamic formula engine (VLOOKUP/XLOOKUP, SUMPRODUCT, 9 pivot tables) and a slicer-driven KPI dashboard. Background spans AML/fraud transaction monitoring (SQL, pivot tables, STR reporting), humanitarian database consulting (25% efficiency gains via Airtable/SQL optimization), and trend analysis with SPSS, Tableau, and Power BI. Also a full-stack developer at heart: completed a hands-on internship architecting a production Flask/MySQL real estate analytics platform (88.3% ML prediction accuracy, 20+ REST endpoints, Dockerized CI/CD), and independently designs, builds, and ships full-stack web and mobile projects end-to-end.</w:t>
+        <w:t xml:space="preserve">Data Analyst with 5+ years of experience turning messy, high-volume data into stakeholder-ready insight with SQL, Python, and advanced Excel. Background spans AML/fraud transaction monitoring at a commercial bank, database consulting for a global humanitarian research organization (a 25% efficiency gain through schema and data-integrity work), and research analysis in SPSS, Tableau, and Power BI. Recent work includes turning a 56,636-row municipal housing dataset into a verified $18.50B market analysis with a slicer-driven KPI dashboard, and modeling 500,000+ e-commerce transactions in PostgreSQL with 30 production SQL queries. Comfortable owning a dataset from raw extract to executive-ready visualization, with full-stack development skills to build the tools around it.</w:t>
       </w:r>
     </w:p>
     <w:p>
@@ -523,52 +523,52 @@
           <w:szCs w:val="20"/>
           <w:rFonts w:ascii="Calibri" w:cs="Calibri" w:eastAsia="Calibri" w:hAnsi="Calibri"/>
         </w:rPr>
-        <w:t xml:space="preserve">• Architected an AI-powered real estate analytics platform processing 49,551+ Canadian properties, achieving 88.3% ML prediction accuracy with an ensemble of XGBoost, LightGBM, and Random Forest</w:t>
-      </w:r>
-    </w:p>
-    <w:p>
-      <w:pPr>
-        <w:spacing w:after="50"/>
-        <w:ind w:left="360"/>
-      </w:pPr>
-      <w:r>
-        <w:rPr>
-          <w:color w:val="FFFFFF"/>
-          <w:sz w:val="20"/>
-          <w:szCs w:val="20"/>
-          <w:rFonts w:ascii="Calibri" w:cs="Calibri" w:eastAsia="Calibri" w:hAnsi="Calibri"/>
-        </w:rPr>
-        <w:t xml:space="preserve">• Led full-stack development of a production Flask application with MySQL and a 20+ endpoint REST API, shipping interactive property mapping and investment analytics</w:t>
-      </w:r>
-    </w:p>
-    <w:p>
-      <w:pPr>
-        <w:spacing w:after="50"/>
-        <w:ind w:left="360"/>
-      </w:pPr>
-      <w:r>
-        <w:rPr>
-          <w:color w:val="FFFFFF"/>
-          <w:sz w:val="20"/>
-          <w:szCs w:val="20"/>
-          <w:rFonts w:ascii="Calibri" w:cs="Calibri" w:eastAsia="Calibri" w:hAnsi="Calibri"/>
-        </w:rPr>
-        <w:t xml:space="preserve">• Implemented a 5-tier API security system with ML-powered XSS/CSRF detection and behavioral analysis, achieving a 100% attack-prevention rate in internal penetration testing</w:t>
-      </w:r>
-    </w:p>
-    <w:p>
-      <w:pPr>
-        <w:spacing w:after="50"/>
-        <w:ind w:left="360"/>
-      </w:pPr>
-      <w:r>
-        <w:rPr>
-          <w:color w:val="FFFFFF"/>
-          <w:sz w:val="20"/>
-          <w:szCs w:val="20"/>
-          <w:rFonts w:ascii="Calibri" w:cs="Calibri" w:eastAsia="Calibri" w:hAnsi="Calibri"/>
-        </w:rPr>
-        <w:t xml:space="preserve">• Deployed a Dockerized CI/CD pipeline achieving 99.9% staging uptime, &lt;400ms API response times, and 85% test coverage while leading a team of 5 developers</w:t>
+        <w:t xml:space="preserve">• Architected an AI-powered real estate analytics platform covering 49,551+ Canadian properties, reaching 88.3% prediction accuracy with an XGBoost, LightGBM, and Random Forest ensemble</w:t>
+      </w:r>
+    </w:p>
+    <w:p>
+      <w:pPr>
+        <w:spacing w:after="50"/>
+        <w:ind w:left="360"/>
+      </w:pPr>
+      <w:r>
+        <w:rPr>
+          <w:color w:val="FFFFFF"/>
+          <w:sz w:val="20"/>
+          <w:szCs w:val="20"/>
+          <w:rFonts w:ascii="Calibri" w:cs="Calibri" w:eastAsia="Calibri" w:hAnsi="Calibri"/>
+        </w:rPr>
+        <w:t xml:space="preserve">• Led full-stack development of a production Flask and MySQL application with a 20+ endpoint REST API, delivering interactive property mapping and investment analytics</w:t>
+      </w:r>
+    </w:p>
+    <w:p>
+      <w:pPr>
+        <w:spacing w:after="50"/>
+        <w:ind w:left="360"/>
+      </w:pPr>
+      <w:r>
+        <w:rPr>
+          <w:color w:val="FFFFFF"/>
+          <w:sz w:val="20"/>
+          <w:szCs w:val="20"/>
+          <w:rFonts w:ascii="Calibri" w:cs="Calibri" w:eastAsia="Calibri" w:hAnsi="Calibri"/>
+        </w:rPr>
+        <w:t xml:space="preserve">• Built a 5-tier API security layer combining ML-based XSS/CSRF detection with behavioral analysis, blocking 100% of attacks in internal penetration testing</w:t>
+      </w:r>
+    </w:p>
+    <w:p>
+      <w:pPr>
+        <w:spacing w:after="50"/>
+        <w:ind w:left="360"/>
+      </w:pPr>
+      <w:r>
+        <w:rPr>
+          <w:color w:val="FFFFFF"/>
+          <w:sz w:val="20"/>
+          <w:szCs w:val="20"/>
+          <w:rFonts w:ascii="Calibri" w:cs="Calibri" w:eastAsia="Calibri" w:hAnsi="Calibri"/>
+        </w:rPr>
+        <w:t xml:space="preserve">• Led a team of 5 interns in deploying a Dockerized CI/CD pipeline that sustained 99.9% staging uptime, sub-400ms API responses, and 85% test coverage</w:t>
       </w:r>
     </w:p>
     <w:p>
@@ -630,37 +630,37 @@
           <w:szCs w:val="20"/>
           <w:rFonts w:ascii="Calibri" w:cs="Calibri" w:eastAsia="Calibri" w:hAnsi="Calibri"/>
         </w:rPr>
-        <w:t xml:space="preserve">• Automated a manual student registration and check-in workflow for the IGNITE Sleep Lounge, eliminating manual processing for 20,000+ students and cutting processing time by 90%</w:t>
-      </w:r>
-    </w:p>
-    <w:p>
-      <w:pPr>
-        <w:spacing w:after="50"/>
-        <w:ind w:left="360"/>
-      </w:pPr>
-      <w:r>
-        <w:rPr>
-          <w:color w:val="FFFFFF"/>
-          <w:sz w:val="20"/>
-          <w:szCs w:val="20"/>
-          <w:rFonts w:ascii="Calibri" w:cs="Calibri" w:eastAsia="Calibri" w:hAnsi="Calibri"/>
-        </w:rPr>
-        <w:t xml:space="preserve">• Led root-cause analysis on the insurance opt-in process, redesigning the workflow to cut processing time by 15%</w:t>
-      </w:r>
-    </w:p>
-    <w:p>
-      <w:pPr>
-        <w:spacing w:after="50"/>
-        <w:ind w:left="360"/>
-      </w:pPr>
-      <w:r>
-        <w:rPr>
-          <w:color w:val="FFFFFF"/>
-          <w:sz w:val="20"/>
-          <w:szCs w:val="20"/>
-          <w:rFonts w:ascii="Calibri" w:cs="Calibri" w:eastAsia="Calibri" w:hAnsi="Calibri"/>
-        </w:rPr>
-        <w:t xml:space="preserve">• Resolved billing issues and account discrepancies across a high volume of inbound student inquiries via phone, email, and live chat</w:t>
+        <w:t xml:space="preserve">• Automated the IGNITE Sleep Lounge's manual registration and check-in workflow for 20,000+ students, eliminating manual processing and cutting processing time by 90%</w:t>
+      </w:r>
+    </w:p>
+    <w:p>
+      <w:pPr>
+        <w:spacing w:after="50"/>
+        <w:ind w:left="360"/>
+      </w:pPr>
+      <w:r>
+        <w:rPr>
+          <w:color w:val="FFFFFF"/>
+          <w:sz w:val="20"/>
+          <w:szCs w:val="20"/>
+          <w:rFonts w:ascii="Calibri" w:cs="Calibri" w:eastAsia="Calibri" w:hAnsi="Calibri"/>
+        </w:rPr>
+        <w:t xml:space="preserve">• Led a root-cause analysis of the student insurance opt-in process and redesigned the workflow, cutting processing time by 15%</w:t>
+      </w:r>
+    </w:p>
+    <w:p>
+      <w:pPr>
+        <w:spacing w:after="50"/>
+        <w:ind w:left="360"/>
+      </w:pPr>
+      <w:r>
+        <w:rPr>
+          <w:color w:val="FFFFFF"/>
+          <w:sz w:val="20"/>
+          <w:szCs w:val="20"/>
+          <w:rFonts w:ascii="Calibri" w:cs="Calibri" w:eastAsia="Calibri" w:hAnsi="Calibri"/>
+        </w:rPr>
+        <w:t xml:space="preserve">• Resolved billing issues and account discrepancies for a high volume of student inquiries across phone, email, and live chat</w:t>
       </w:r>
     </w:p>
     <w:p>
@@ -722,52 +722,52 @@
           <w:szCs w:val="20"/>
           <w:rFonts w:ascii="Calibri" w:cs="Calibri" w:eastAsia="Calibri" w:hAnsi="Calibri"/>
         </w:rPr>
-        <w:t xml:space="preserve">• Resolved data-integrity issues across the GDHO Airtable and database while designing optimized schemas with the team lead, driving a 25% increase in operational efficiency</w:t>
-      </w:r>
-    </w:p>
-    <w:p>
-      <w:pPr>
-        <w:spacing w:after="50"/>
-        <w:ind w:left="360"/>
-      </w:pPr>
-      <w:r>
-        <w:rPr>
-          <w:color w:val="FFFFFF"/>
-          <w:sz w:val="20"/>
-          <w:szCs w:val="20"/>
-          <w:rFonts w:ascii="Calibri" w:cs="Calibri" w:eastAsia="Calibri" w:hAnsi="Calibri"/>
-        </w:rPr>
-        <w:t xml:space="preserve">• Conducted trend analysis using SPSS and SQL, then visualized findings in Tableau and Power BI to drive data-informed decisions for humanitarian stakeholders worldwide</w:t>
-      </w:r>
-    </w:p>
-    <w:p>
-      <w:pPr>
-        <w:spacing w:after="50"/>
-        <w:ind w:left="360"/>
-      </w:pPr>
-      <w:r>
-        <w:rPr>
-          <w:color w:val="FFFFFF"/>
-          <w:sz w:val="20"/>
-          <w:szCs w:val="20"/>
-          <w:rFonts w:ascii="Calibri" w:cs="Calibri" w:eastAsia="Calibri" w:hAnsi="Calibri"/>
-        </w:rPr>
-        <w:t xml:space="preserve">• Built and segmented 1,200+ partner and audience lists using Airtable and SQL, increasing campaign engagement by 30%</w:t>
-      </w:r>
-    </w:p>
-    <w:p>
-      <w:pPr>
-        <w:spacing w:after="50"/>
-        <w:ind w:left="360"/>
-      </w:pPr>
-      <w:r>
-        <w:rPr>
-          <w:color w:val="FFFFFF"/>
-          <w:sz w:val="20"/>
-          <w:szCs w:val="20"/>
-          <w:rFonts w:ascii="Calibri" w:cs="Calibri" w:eastAsia="Calibri" w:hAnsi="Calibri"/>
-        </w:rPr>
-        <w:t xml:space="preserve">• Qualified 350+ leads from events and surveys using structured frameworks, converting 120 into high-priority partnership opportunities</w:t>
+        <w:t xml:space="preserve">• Fixed data-integrity issues across the GDHO Airtable base and database and co-designed optimized schemas with the team lead, increasing operational efficiency by 25%</w:t>
+      </w:r>
+    </w:p>
+    <w:p>
+      <w:pPr>
+        <w:spacing w:after="50"/>
+        <w:ind w:left="360"/>
+      </w:pPr>
+      <w:r>
+        <w:rPr>
+          <w:color w:val="FFFFFF"/>
+          <w:sz w:val="20"/>
+          <w:szCs w:val="20"/>
+          <w:rFonts w:ascii="Calibri" w:cs="Calibri" w:eastAsia="Calibri" w:hAnsi="Calibri"/>
+        </w:rPr>
+        <w:t xml:space="preserve">• Analyzed trends in SPSS and SQL and presented them in Tableau and Power BI visualizations that informed decisions for humanitarian stakeholders worldwide</w:t>
+      </w:r>
+    </w:p>
+    <w:p>
+      <w:pPr>
+        <w:spacing w:after="50"/>
+        <w:ind w:left="360"/>
+      </w:pPr>
+      <w:r>
+        <w:rPr>
+          <w:color w:val="FFFFFF"/>
+          <w:sz w:val="20"/>
+          <w:szCs w:val="20"/>
+          <w:rFonts w:ascii="Calibri" w:cs="Calibri" w:eastAsia="Calibri" w:hAnsi="Calibri"/>
+        </w:rPr>
+        <w:t xml:space="preserve">• Built and segmented 1,200+ partner and audience lists in Airtable and SQL, lifting campaign engagement by 30%</w:t>
+      </w:r>
+    </w:p>
+    <w:p>
+      <w:pPr>
+        <w:spacing w:after="50"/>
+        <w:ind w:left="360"/>
+      </w:pPr>
+      <w:r>
+        <w:rPr>
+          <w:color w:val="FFFFFF"/>
+          <w:sz w:val="20"/>
+          <w:szCs w:val="20"/>
+          <w:rFonts w:ascii="Calibri" w:cs="Calibri" w:eastAsia="Calibri" w:hAnsi="Calibri"/>
+        </w:rPr>
+        <w:t xml:space="preserve">• Qualified 350+ leads from events and surveys with structured frameworks and converted 120 into high-priority partnership opportunities</w:t>
       </w:r>
     </w:p>
     <w:p>
@@ -829,22 +829,22 @@
           <w:szCs w:val="20"/>
           <w:rFonts w:ascii="Calibri" w:cs="Calibri" w:eastAsia="Calibri" w:hAnsi="Calibri"/>
         </w:rPr>
-        <w:t xml:space="preserve">• Conducted quantitative and qualitative analysis on leadership barriers among LGBTQ+ and BIPOC youth using SPSS, SQL, and Excel, then visualized findings in Power BI and Infogram for stakeholder presentations</w:t>
-      </w:r>
-    </w:p>
-    <w:p>
-      <w:pPr>
-        <w:spacing w:after="50"/>
-        <w:ind w:left="360"/>
-      </w:pPr>
-      <w:r>
-        <w:rPr>
-          <w:color w:val="FFFFFF"/>
-          <w:sz w:val="20"/>
-          <w:szCs w:val="20"/>
-          <w:rFonts w:ascii="Calibri" w:cs="Calibri" w:eastAsia="Calibri" w:hAnsi="Calibri"/>
-        </w:rPr>
-        <w:t xml:space="preserve">• Authored research reports synthesizing key trends and statistical findings, presenting outcomes directly to stakeholders to guide data-driven program decisions</w:t>
+        <w:t xml:space="preserve">• Investigated leadership barriers facing LGBTQ+ and BIPOC youth through quantitative and qualitative analysis in SPSS, SQL, and Excel, visualizing findings in Power BI and Infogram for stakeholders</w:t>
+      </w:r>
+    </w:p>
+    <w:p>
+      <w:pPr>
+        <w:spacing w:after="50"/>
+        <w:ind w:left="360"/>
+      </w:pPr>
+      <w:r>
+        <w:rPr>
+          <w:color w:val="FFFFFF"/>
+          <w:sz w:val="20"/>
+          <w:szCs w:val="20"/>
+          <w:rFonts w:ascii="Calibri" w:cs="Calibri" w:eastAsia="Calibri" w:hAnsi="Calibri"/>
+        </w:rPr>
+        <w:t xml:space="preserve">• Wrote research reports synthesizing key trends and statistical findings and presented them directly to stakeholders to guide program decisions</w:t>
       </w:r>
     </w:p>
     <w:p>
@@ -906,22 +906,22 @@
           <w:szCs w:val="20"/>
           <w:rFonts w:ascii="Calibri" w:cs="Calibri" w:eastAsia="Calibri" w:hAnsi="Calibri"/>
         </w:rPr>
-        <w:t xml:space="preserve">• Led a departmental initiative to digitize lesson-plan creation and approval through the school website, replacing a fully manual, paper-based process</w:t>
-      </w:r>
-    </w:p>
-    <w:p>
-      <w:pPr>
-        <w:spacing w:after="50"/>
-        <w:ind w:left="360"/>
-      </w:pPr>
-      <w:r>
-        <w:rPr>
-          <w:color w:val="FFFFFF"/>
-          <w:sz w:val="20"/>
-          <w:szCs w:val="20"/>
-          <w:rFonts w:ascii="Calibri" w:cs="Calibri" w:eastAsia="Calibri" w:hAnsi="Calibri"/>
-        </w:rPr>
-        <w:t xml:space="preserve">• Streamlined lesson-plan review and approval turnaround for the department, increasing teacher collaboration and operational efficiency by 50%</w:t>
+        <w:t xml:space="preserve">• Led the department's move from paper-based to digital lesson-plan creation and approval through the school website</w:t>
+      </w:r>
+    </w:p>
+    <w:p>
+      <w:pPr>
+        <w:spacing w:after="50"/>
+        <w:ind w:left="360"/>
+      </w:pPr>
+      <w:r>
+        <w:rPr>
+          <w:color w:val="FFFFFF"/>
+          <w:sz w:val="20"/>
+          <w:szCs w:val="20"/>
+          <w:rFonts w:ascii="Calibri" w:cs="Calibri" w:eastAsia="Calibri" w:hAnsi="Calibri"/>
+        </w:rPr>
+        <w:t xml:space="preserve">• Shortened lesson-plan review and approval turnaround, increasing teacher collaboration and departmental efficiency by 50%</w:t>
       </w:r>
     </w:p>
     <w:p>
@@ -983,52 +983,52 @@
           <w:szCs w:val="20"/>
           <w:rFonts w:ascii="Calibri" w:cs="Calibri" w:eastAsia="Calibri" w:hAnsi="Calibri"/>
         </w:rPr>
-        <w:t xml:space="preserve">• Monitored and analyzed daily transactions across a retail and corporate client portfolio, detecting and preventing money laundering, terrorist financing, and fraud</w:t>
-      </w:r>
-    </w:p>
-    <w:p>
-      <w:pPr>
-        <w:spacing w:after="50"/>
-        <w:ind w:left="360"/>
-      </w:pPr>
-      <w:r>
-        <w:rPr>
-          <w:color w:val="FFFFFF"/>
-          <w:sz w:val="20"/>
-          <w:szCs w:val="20"/>
-          <w:rFonts w:ascii="Calibri" w:cs="Calibri" w:eastAsia="Calibri" w:hAnsi="Calibri"/>
-        </w:rPr>
-        <w:t xml:space="preserve">• Investigated 30+ system-generated alerts weekly using SQL queries and advanced Excel (VLOOKUP, Pivot Tables) to identify and escalate suspicious activity</w:t>
-      </w:r>
-    </w:p>
-    <w:p>
-      <w:pPr>
-        <w:spacing w:after="50"/>
-        <w:ind w:left="360"/>
-      </w:pPr>
-      <w:r>
-        <w:rPr>
-          <w:color w:val="FFFFFF"/>
-          <w:sz w:val="20"/>
-          <w:szCs w:val="20"/>
-          <w:rFonts w:ascii="Calibri" w:cs="Calibri" w:eastAsia="Calibri" w:hAnsi="Calibri"/>
-        </w:rPr>
-        <w:t xml:space="preserve">• Conducted Customer Due Diligence (CDD) and Enhanced Due Diligence (EDD) for high-risk clients, ensuring full regulatory compliance</w:t>
-      </w:r>
-    </w:p>
-    <w:p>
-      <w:pPr>
-        <w:spacing w:after="50"/>
-        <w:ind w:left="360"/>
-      </w:pPr>
-      <w:r>
-        <w:rPr>
-          <w:color w:val="FFFFFF"/>
-          <w:sz w:val="20"/>
-          <w:szCs w:val="20"/>
-          <w:rFonts w:ascii="Calibri" w:cs="Calibri" w:eastAsia="Calibri" w:hAnsi="Calibri"/>
-        </w:rPr>
-        <w:t xml:space="preserve">• Drafted Suspicious Transaction Reports (STRs) for the Nigerian Financial Intelligence Unit, contributing to a 10% increase in branch reporting accuracy</w:t>
+        <w:t xml:space="preserve">• Monitored daily transactions across a retail and corporate client portfolio to detect and prevent money laundering, terrorist financing, and fraud</w:t>
+      </w:r>
+    </w:p>
+    <w:p>
+      <w:pPr>
+        <w:spacing w:after="50"/>
+        <w:ind w:left="360"/>
+      </w:pPr>
+      <w:r>
+        <w:rPr>
+          <w:color w:val="FFFFFF"/>
+          <w:sz w:val="20"/>
+          <w:szCs w:val="20"/>
+          <w:rFonts w:ascii="Calibri" w:cs="Calibri" w:eastAsia="Calibri" w:hAnsi="Calibri"/>
+        </w:rPr>
+        <w:t xml:space="preserve">• Investigated 30+ system-generated alerts weekly with SQL queries and advanced Excel (VLOOKUP, pivot tables), escalating suspicious activity</w:t>
+      </w:r>
+    </w:p>
+    <w:p>
+      <w:pPr>
+        <w:spacing w:after="50"/>
+        <w:ind w:left="360"/>
+      </w:pPr>
+      <w:r>
+        <w:rPr>
+          <w:color w:val="FFFFFF"/>
+          <w:sz w:val="20"/>
+          <w:szCs w:val="20"/>
+          <w:rFonts w:ascii="Calibri" w:cs="Calibri" w:eastAsia="Calibri" w:hAnsi="Calibri"/>
+        </w:rPr>
+        <w:t xml:space="preserve">• Performed Customer Due Diligence (CDD) and Enhanced Due Diligence (EDD) on high-risk clients to meet regulatory requirements</w:t>
+      </w:r>
+    </w:p>
+    <w:p>
+      <w:pPr>
+        <w:spacing w:after="50"/>
+        <w:ind w:left="360"/>
+      </w:pPr>
+      <w:r>
+        <w:rPr>
+          <w:color w:val="FFFFFF"/>
+          <w:sz w:val="20"/>
+          <w:szCs w:val="20"/>
+          <w:rFonts w:ascii="Calibri" w:cs="Calibri" w:eastAsia="Calibri" w:hAnsi="Calibri"/>
+        </w:rPr>
+        <w:t xml:space="preserve">• Drafted Suspicious Transaction Reports (STRs) for the Nigerian Financial Intelligence Unit, contributing to a 10% gain in branch reporting accuracy</w:t>
       </w:r>
     </w:p>
     <w:p>
@@ -1090,22 +1090,22 @@
           <w:szCs w:val="20"/>
           <w:rFonts w:ascii="Calibri" w:cs="Calibri" w:eastAsia="Calibri" w:hAnsi="Calibri"/>
         </w:rPr>
-        <w:t xml:space="preserve">• Pioneered the school's transition from manual to digital result computation, improving grading accuracy and cutting processing time by 75%</w:t>
-      </w:r>
-    </w:p>
-    <w:p>
-      <w:pPr>
-        <w:spacing w:after="50"/>
-        <w:ind w:left="360"/>
-      </w:pPr>
-      <w:r>
-        <w:rPr>
-          <w:color w:val="FFFFFF"/>
-          <w:sz w:val="20"/>
-          <w:szCs w:val="20"/>
-          <w:rFonts w:ascii="Calibri" w:cs="Calibri" w:eastAsia="Calibri" w:hAnsi="Calibri"/>
-        </w:rPr>
-        <w:t xml:space="preserve">• Applied data-driven teaching strategies informed by student performance trends, lifting average student grades by 20%</w:t>
+        <w:t xml:space="preserve">• Moved the school from manual to digital result computation, improving grading accuracy and cutting processing time by 75%</w:t>
+      </w:r>
+    </w:p>
+    <w:p>
+      <w:pPr>
+        <w:spacing w:after="50"/>
+        <w:ind w:left="360"/>
+      </w:pPr>
+      <w:r>
+        <w:rPr>
+          <w:color w:val="FFFFFF"/>
+          <w:sz w:val="20"/>
+          <w:szCs w:val="20"/>
+          <w:rFonts w:ascii="Calibri" w:cs="Calibri" w:eastAsia="Calibri" w:hAnsi="Calibri"/>
+        </w:rPr>
+        <w:t xml:space="preserve">• Used student performance trends to target teaching strategies, raising average student grades by 20%</w:t>
       </w:r>
     </w:p>
     <w:p>
@@ -1167,37 +1167,37 @@
           <w:szCs w:val="20"/>
           <w:rFonts w:ascii="Calibri" w:cs="Calibri" w:eastAsia="Calibri" w:hAnsi="Calibri"/>
         </w:rPr>
-        <w:t xml:space="preserve">• Led the installation and configuration of 40 workstations, ensuring optimal performance with zero reported issues post-installation</w:t>
-      </w:r>
-    </w:p>
-    <w:p>
-      <w:pPr>
-        <w:spacing w:after="50"/>
-        <w:ind w:left="360"/>
-      </w:pPr>
-      <w:r>
-        <w:rPr>
-          <w:color w:val="FFFFFF"/>
-          <w:sz w:val="20"/>
-          <w:szCs w:val="20"/>
-          <w:rFonts w:ascii="Calibri" w:cs="Calibri" w:eastAsia="Calibri" w:hAnsi="Calibri"/>
-        </w:rPr>
-        <w:t xml:space="preserve">• Resolved technical issues for 65+ end-users promptly and accurately while strengthening antivirus and cybersecurity protocols across all systems</w:t>
-      </w:r>
-    </w:p>
-    <w:p>
-      <w:pPr>
-        <w:spacing w:after="50"/>
-        <w:ind w:left="360"/>
-      </w:pPr>
-      <w:r>
-        <w:rPr>
-          <w:color w:val="FFFFFF"/>
-          <w:sz w:val="20"/>
-          <w:szCs w:val="20"/>
-          <w:rFonts w:ascii="Calibri" w:cs="Calibri" w:eastAsia="Calibri" w:hAnsi="Calibri"/>
-        </w:rPr>
-        <w:t xml:space="preserve">• Implemented a remote support system, streamlining registration and payment assistance for students</w:t>
+        <w:t xml:space="preserve">• Led the installation and configuration of 40 workstations, with zero issues reported after installation</w:t>
+      </w:r>
+    </w:p>
+    <w:p>
+      <w:pPr>
+        <w:spacing w:after="50"/>
+        <w:ind w:left="360"/>
+      </w:pPr>
+      <w:r>
+        <w:rPr>
+          <w:color w:val="FFFFFF"/>
+          <w:sz w:val="20"/>
+          <w:szCs w:val="20"/>
+          <w:rFonts w:ascii="Calibri" w:cs="Calibri" w:eastAsia="Calibri" w:hAnsi="Calibri"/>
+        </w:rPr>
+        <w:t xml:space="preserve">• Resolved technical issues for 65+ end users and strengthened antivirus and cybersecurity protections across all systems</w:t>
+      </w:r>
+    </w:p>
+    <w:p>
+      <w:pPr>
+        <w:spacing w:after="50"/>
+        <w:ind w:left="360"/>
+      </w:pPr>
+      <w:r>
+        <w:rPr>
+          <w:color w:val="FFFFFF"/>
+          <w:sz w:val="20"/>
+          <w:szCs w:val="20"/>
+          <w:rFonts w:ascii="Calibri" w:cs="Calibri" w:eastAsia="Calibri" w:hAnsi="Calibri"/>
+        </w:rPr>
+        <w:t xml:space="preserve">• Set up a remote support system that streamlined course registration and payment help for students</w:t>
       </w:r>
     </w:p>
     <w:p>
@@ -1259,22 +1259,22 @@
           <w:szCs w:val="20"/>
           <w:rFonts w:ascii="Calibri" w:cs="Calibri" w:eastAsia="Calibri" w:hAnsi="Calibri"/>
         </w:rPr>
-        <w:t xml:space="preserve">• Designed and delivered a project-based computer science curriculum aligned with industry trends, driving a 30% increase in STEM extracurricular enrollment</w:t>
-      </w:r>
-    </w:p>
-    <w:p>
-      <w:pPr>
-        <w:spacing w:after="50"/>
-        <w:ind w:left="360"/>
-      </w:pPr>
-      <w:r>
-        <w:rPr>
-          <w:color w:val="FFFFFF"/>
-          <w:sz w:val="20"/>
-          <w:szCs w:val="20"/>
-          <w:rFonts w:ascii="Calibri" w:cs="Calibri" w:eastAsia="Calibri" w:hAnsi="Calibri"/>
-        </w:rPr>
-        <w:t xml:space="preserve">• Coached the school's coding team through a competitive programming curriculum, leading them to a first-place win at a regional competition</w:t>
+        <w:t xml:space="preserve">• Designed and taught a project-based computer science curriculum aligned with industry trends, increasing STEM extracurricular enrollment by 30%</w:t>
+      </w:r>
+    </w:p>
+    <w:p>
+      <w:pPr>
+        <w:spacing w:after="50"/>
+        <w:ind w:left="360"/>
+      </w:pPr>
+      <w:r>
+        <w:rPr>
+          <w:color w:val="FFFFFF"/>
+          <w:sz w:val="20"/>
+          <w:szCs w:val="20"/>
+          <w:rFonts w:ascii="Calibri" w:cs="Calibri" w:eastAsia="Calibri" w:hAnsi="Calibri"/>
+        </w:rPr>
+        <w:t xml:space="preserve">• Coached the school's coding team through a competitive programming curriculum to first place at a regional competition</w:t>
       </w:r>
     </w:p>
     <w:p>
@@ -1352,7 +1352,7 @@
           <w:szCs w:val="20"/>
           <w:rFonts w:ascii="Calibri" w:cs="Calibri" w:eastAsia="Calibri" w:hAnsi="Calibri"/>
         </w:rPr>
-        <w:t xml:space="preserve">GPA: 86.5%</w:t>
+        <w:t xml:space="preserve">GPA: 86.5% | graduated with Honours</w:t>
       </w:r>
     </w:p>
     <w:p>
@@ -1468,7 +1468,7 @@
           <w:szCs w:val="20"/>
           <w:rFonts w:ascii="Calibri" w:cs="Calibri" w:eastAsia="Calibri" w:hAnsi="Calibri"/>
         </w:rPr>
-        <w:t xml:space="preserve">GPA: 3.75 in a 5-point grading system</w:t>
+        <w:t xml:space="preserve">GPA: 3.75 in a 5-point grading system | graduated with Second Class Upper Division honours</w:t>
       </w:r>
     </w:p>
     <w:p>
@@ -1592,39 +1592,39 @@
           <w:szCs w:val="20"/>
           <w:rFonts w:ascii="Calibri" w:cs="Calibri" w:eastAsia="Calibri" w:hAnsi="Calibri"/>
         </w:rPr>
-        <w:t xml:space="preserve">• Built and launched a full-stack personal finance platform (web, Android, iOS) from a single Capacitor/React codebase, integrating live Plaid bank-linking, Gemini AI-narrated insights, and automated statement import across 24+ Canadian banks</w:t>
-      </w:r>
-    </w:p>
-    <w:p>
-      <w:pPr>
-        <w:spacing w:after="50"/>
-        <w:ind w:left="360"/>
-      </w:pPr>
-      <w:r>
-        <w:rPr>
-          <w:color w:val="FFD700"/>
-          <w:sz w:val="18"/>
-          <w:szCs w:val="18"/>
-          <w:rFonts w:ascii="Calibri" w:cs="Calibri" w:eastAsia="Calibri" w:hAnsi="Calibri"/>
-        </w:rPr>
-        <w:t xml:space="preserve">  Live: https://tekvwamoney.com/ | GitHub: https://github.com/EfeObus/Tekvwa-Money</w:t>
-      </w:r>
-    </w:p>
-    <w:p>
-      <w:pPr>
-        <w:spacing w:after="100"/>
-        <w:ind w:left="360"/>
-      </w:pPr>
-      <w:r>
-        <w:rPr>
-          <w:i/>
-          <w:iCs/>
-          <w:color w:val="CCCCCC"/>
-          <w:sz w:val="18"/>
-          <w:szCs w:val="18"/>
-          <w:rFonts w:ascii="Calibri" w:cs="Calibri" w:eastAsia="Calibri" w:hAnsi="Calibri"/>
-        </w:rPr>
-        <w:t xml:space="preserve">  Technologies: React, Express.js, PostgreSQL, Zustand, Tailwind CSS, Capacitor (Android/iOS), Plaid API, Gemini (Vertex AI), Firebase Cloud Messaging</w:t>
+        <w:t xml:space="preserve">• Built and launched a full-stack personal finance platform (web, Android, iOS) live in Canada and Nigeria, with Plaid and Mono bank-linking, Gemini AI insights, home-screen widgets, and SOC 2-style security (mandatory MFA, device session control, tamper-evident audit logs)</w:t>
+      </w:r>
+    </w:p>
+    <w:p>
+      <w:pPr>
+        <w:spacing w:after="50"/>
+        <w:ind w:left="360"/>
+      </w:pPr>
+      <w:r>
+        <w:rPr>
+          <w:color w:val="FFD700"/>
+          <w:sz w:val="18"/>
+          <w:szCs w:val="18"/>
+          <w:rFonts w:ascii="Calibri" w:cs="Calibri" w:eastAsia="Calibri" w:hAnsi="Calibri"/>
+        </w:rPr>
+        <w:t xml:space="preserve">  Live: https://tekvwamoney.com/</w:t>
+      </w:r>
+    </w:p>
+    <w:p>
+      <w:pPr>
+        <w:spacing w:after="100"/>
+        <w:ind w:left="360"/>
+      </w:pPr>
+      <w:r>
+        <w:rPr>
+          <w:i/>
+          <w:iCs/>
+          <w:color w:val="CCCCCC"/>
+          <w:sz w:val="18"/>
+          <w:szCs w:val="18"/>
+          <w:rFonts w:ascii="Calibri" w:cs="Calibri" w:eastAsia="Calibri" w:hAnsi="Calibri"/>
+        </w:rPr>
+        <w:t xml:space="preserve">  Technologies: React, Express.js, PostgreSQL, Zustand, Tailwind CSS, Capacitor (Android/iOS), Plaid API, Mono API, Gemini (Vertex AI), Google Cloud, Firebase Cloud Messaging, Semgrep</w:t>
       </w:r>
     </w:p>
     <w:p>
@@ -1675,21 +1675,6 @@
     </w:p>
     <w:p>
       <w:pPr>
-        <w:spacing w:after="50"/>
-        <w:ind w:left="360"/>
-      </w:pPr>
-      <w:r>
-        <w:rPr>
-          <w:color w:val="FFD700"/>
-          <w:sz w:val="18"/>
-          <w:szCs w:val="18"/>
-          <w:rFonts w:ascii="Calibri" w:cs="Calibri" w:eastAsia="Calibri" w:hAnsi="Calibri"/>
-        </w:rPr>
-        <w:t xml:space="preserve">  Live: https://tekvwa-life-production.up.railway.app/ | GitHub: https://github.com/EfeObus/TekVwa-Life</w:t>
-      </w:r>
-    </w:p>
-    <w:p>
-      <w:pPr>
         <w:spacing w:after="100"/>
         <w:ind w:left="360"/>
       </w:pPr>
@@ -1721,7 +1706,7 @@
           <w:szCs w:val="22"/>
           <w:rFonts w:ascii="Calibri" w:cs="Calibri" w:eastAsia="Calibri" w:hAnsi="Calibri"/>
         </w:rPr>
-        <w:t xml:space="preserve">TekVwarho ProAudit</w:t>
+        <w:t xml:space="preserve">Tekvwa Pro Audit</w:t>
       </w:r>
       <w:tab/>
       <w:r>
@@ -1748,39 +1733,39 @@
           <w:szCs w:val="20"/>
           <w:rFonts w:ascii="Calibri" w:cs="Calibri" w:eastAsia="Calibri" w:hAnsi="Calibri"/>
         </w:rPr>
-        <w:t xml:space="preserve">• Built an enterprise Nigerian tax-compliance and forensic-audit platform spanning 500+ API routes and 400+ automated tests, featuring Benford's Law fraud detection and a hash-chain immutable ledger</w:t>
-      </w:r>
-    </w:p>
-    <w:p>
-      <w:pPr>
-        <w:spacing w:after="50"/>
-        <w:ind w:left="360"/>
-      </w:pPr>
-      <w:r>
-        <w:rPr>
-          <w:color w:val="FFD700"/>
-          <w:sz w:val="18"/>
-          <w:szCs w:val="18"/>
-          <w:rFonts w:ascii="Calibri" w:cs="Calibri" w:eastAsia="Calibri" w:hAnsi="Calibri"/>
-        </w:rPr>
-        <w:t xml:space="preserve">  Live: https://ingenious-emotion-production-c3c3.up.railway.app/ | GitHub: https://github.com/EfeObus/TekVwarho-ProAudit</w:t>
-      </w:r>
-    </w:p>
-    <w:p>
-      <w:pPr>
-        <w:spacing w:after="100"/>
-        <w:ind w:left="360"/>
-      </w:pPr>
-      <w:r>
-        <w:rPr>
-          <w:i/>
-          <w:iCs/>
-          <w:color w:val="CCCCCC"/>
-          <w:sz w:val="18"/>
-          <w:szCs w:val="18"/>
-          <w:rFonts w:ascii="Calibri" w:cs="Calibri" w:eastAsia="Calibri" w:hAnsi="Calibri"/>
-        </w:rPr>
-        <w:t xml:space="preserve">  Technologies: Python, FastAPI, PostgreSQL, SQLAlchemy, Alembic, HTMX, TailwindCSS, Celery, Redis, Cryptography</w:t>
+        <w:t xml:space="preserve">• Built a Nigerian tax compliance, payroll and forensic audit platform (Benford's Law, Z-score, 3-way matching), migrated it to Google Cloud, and closed cross-tenant access risk across 164 endpoints with a central access check and cross-tenant test suite</w:t>
+      </w:r>
+    </w:p>
+    <w:p>
+      <w:pPr>
+        <w:spacing w:after="50"/>
+        <w:ind w:left="360"/>
+      </w:pPr>
+      <w:r>
+        <w:rPr>
+          <w:color w:val="FFD700"/>
+          <w:sz w:val="18"/>
+          <w:szCs w:val="18"/>
+          <w:rFonts w:ascii="Calibri" w:cs="Calibri" w:eastAsia="Calibri" w:hAnsi="Calibri"/>
+        </w:rPr>
+        <w:t xml:space="preserve">  GitHub: https://github.com/EfeObus/Tekvwa-Pro-Audit</w:t>
+      </w:r>
+    </w:p>
+    <w:p>
+      <w:pPr>
+        <w:spacing w:after="100"/>
+        <w:ind w:left="360"/>
+      </w:pPr>
+      <w:r>
+        <w:rPr>
+          <w:i/>
+          <w:iCs/>
+          <w:color w:val="CCCCCC"/>
+          <w:sz w:val="18"/>
+          <w:szCs w:val="18"/>
+          <w:rFonts w:ascii="Calibri" w:cs="Calibri" w:eastAsia="Calibri" w:hAnsi="Calibri"/>
+        </w:rPr>
+        <w:t xml:space="preserve">  Technologies: Python, FastAPI, PostgreSQL, SQLAlchemy, Alembic, HTMX, TailwindCSS, Celery, Redis, Google Cloud Run, Cloud SQL, Paystack</w:t>
       </w:r>
     </w:p>
     <w:p>
@@ -1826,39 +1811,24 @@
           <w:szCs w:val="20"/>
           <w:rFonts w:ascii="Calibri" w:cs="Calibri" w:eastAsia="Calibri" w:hAnsi="Calibri"/>
         </w:rPr>
-        <w:t xml:space="preserve">• Migrated a 17-module statistical analysis platform from Railway to Google Cloud Run and OpenAI to Vertex AI (Gemini via Application Default Credentials), shipping an auto-analysis recommendation engine, interactive drag/resize dashboards, and app-wide security hardening</w:t>
-      </w:r>
-    </w:p>
-    <w:p>
-      <w:pPr>
-        <w:spacing w:after="50"/>
-        <w:ind w:left="360"/>
-      </w:pPr>
-      <w:r>
-        <w:rPr>
-          <w:color w:val="FFD700"/>
-          <w:sz w:val="18"/>
-          <w:szCs w:val="18"/>
-          <w:rFonts w:ascii="Calibri" w:cs="Calibri" w:eastAsia="Calibri" w:hAnsi="Calibri"/>
-        </w:rPr>
-        <w:t xml:space="preserve">  Live: https://tekvwarho-analysis-551794668026.northamerica-northeast1.run.app/ | GitHub: https://github.com/EfeObus/TekVwarho-Analysis</w:t>
-      </w:r>
-    </w:p>
-    <w:p>
-      <w:pPr>
-        <w:spacing w:after="100"/>
-        <w:ind w:left="360"/>
-      </w:pPr>
-      <w:r>
-        <w:rPr>
-          <w:i/>
-          <w:iCs/>
-          <w:color w:val="CCCCCC"/>
-          <w:sz w:val="18"/>
-          <w:szCs w:val="18"/>
-          <w:rFonts w:ascii="Calibri" w:cs="Calibri" w:eastAsia="Calibri" w:hAnsi="Calibri"/>
-        </w:rPr>
-        <w:t xml:space="preserve">  Technologies: Flask, PostgreSQL, Google Cloud Run, Vertex AI (Gemini), Cloud SQL, Plotly.js, Bootstrap, Python</w:t>
+        <w:t xml:space="preserve">• Built a guided statistical analysis platform (web and Windows/macOS desktop, v5.109) with an FDR-corrected analysis-intelligence engine, executive PDF/Word/PowerPoint reports, warehouse connectors (Snowflake, BigQuery, Redshift), Python and R SDKs, and team workspaces with SSO and MFA</w:t>
+      </w:r>
+    </w:p>
+    <w:p>
+      <w:pPr>
+        <w:spacing w:after="100"/>
+        <w:ind w:left="360"/>
+      </w:pPr>
+      <w:r>
+        <w:rPr>
+          <w:i/>
+          <w:iCs/>
+          <w:color w:val="CCCCCC"/>
+          <w:sz w:val="18"/>
+          <w:szCs w:val="18"/>
+          <w:rFonts w:ascii="Calibri" w:cs="Calibri" w:eastAsia="Calibri" w:hAnsi="Calibri"/>
+        </w:rPr>
+        <w:t xml:space="preserve">  Technologies: Python, Flask, PostgreSQL, Google Cloud Run, Cloud SQL, Vertex AI (Gemini), Redis, Plotly.js, Electron, Snowflake / BigQuery / Redshift connectors</w:t>
       </w:r>
     </w:p>
     <w:p>
@@ -1919,7 +1889,7 @@
           <w:szCs w:val="18"/>
           <w:rFonts w:ascii="Calibri" w:cs="Calibri" w:eastAsia="Calibri" w:hAnsi="Calibri"/>
         </w:rPr>
-        <w:t xml:space="preserve">  Live: https://vwatek-apply-production.up.railway.app | GitHub: https://github.com/EfeObus/VwaTek-Apply</w:t>
+        <w:t xml:space="preserve">  GitHub: https://github.com/EfeObus/VwaTek-Apply</w:t>
       </w:r>
     </w:p>
     <w:p>
@@ -1987,21 +1957,6 @@
     </w:p>
     <w:p>
       <w:pPr>
-        <w:spacing w:after="50"/>
-        <w:ind w:left="360"/>
-      </w:pPr>
-      <w:r>
-        <w:rPr>
-          <w:color w:val="FFD700"/>
-          <w:sz w:val="18"/>
-          <w:szCs w:val="18"/>
-          <w:rFonts w:ascii="Calibri" w:cs="Calibri" w:eastAsia="Calibri" w:hAnsi="Calibri"/>
-        </w:rPr>
-        <w:t xml:space="preserve">  GitHub: https://github.com/EfeObus/JTOV-Network</w:t>
-      </w:r>
-    </w:p>
-    <w:p>
-      <w:pPr>
         <w:spacing w:after="100"/>
         <w:ind w:left="360"/>
       </w:pPr>
@@ -2065,21 +2020,6 @@
     </w:p>
     <w:p>
       <w:pPr>
-        <w:spacing w:after="50"/>
-        <w:ind w:left="360"/>
-      </w:pPr>
-      <w:r>
-        <w:rPr>
-          <w:color w:val="FFD700"/>
-          <w:sz w:val="18"/>
-          <w:szCs w:val="18"/>
-          <w:rFonts w:ascii="Calibri" w:cs="Calibri" w:eastAsia="Calibri" w:hAnsi="Calibri"/>
-        </w:rPr>
-        <w:t xml:space="preserve">  GitHub: https://github.com/EfeObus/LegalEagleAI</w:t>
-      </w:r>
-    </w:p>
-    <w:p>
-      <w:pPr>
         <w:spacing w:after="100"/>
         <w:ind w:left="360"/>
       </w:pPr>
@@ -2111,7 +2051,7 @@
           <w:szCs w:val="22"/>
           <w:rFonts w:ascii="Calibri" w:cs="Calibri" w:eastAsia="Calibri" w:hAnsi="Calibri"/>
         </w:rPr>
-        <w:t xml:space="preserve">TekVwarho Properties</w:t>
+        <w:t xml:space="preserve">TekVwa Properties</w:t>
       </w:r>
       <w:tab/>
       <w:r>
@@ -2138,39 +2078,39 @@
           <w:szCs w:val="20"/>
           <w:rFonts w:ascii="Calibri" w:cs="Calibri" w:eastAsia="Calibri" w:hAnsi="Calibri"/>
         </w:rPr>
-        <w:t xml:space="preserve">• Launched a Nigerian property rental marketplace connecting landlords and tenants directly, automating ID verification, fraud detection, and legal agreement generation</w:t>
-      </w:r>
-    </w:p>
-    <w:p>
-      <w:pPr>
-        <w:spacing w:after="50"/>
-        <w:ind w:left="360"/>
-      </w:pPr>
-      <w:r>
-        <w:rPr>
-          <w:color w:val="FFD700"/>
-          <w:sz w:val="18"/>
-          <w:szCs w:val="18"/>
-          <w:rFonts w:ascii="Calibri" w:cs="Calibri" w:eastAsia="Calibri" w:hAnsi="Calibri"/>
-        </w:rPr>
-        <w:t xml:space="preserve">  Live: https://tekvwarho-properties-production.up.railway.app/ | GitHub: https://github.com/EfeObus/TekVwarho-Properties</w:t>
-      </w:r>
-    </w:p>
-    <w:p>
-      <w:pPr>
-        <w:spacing w:after="100"/>
-        <w:ind w:left="360"/>
-      </w:pPr>
-      <w:r>
-        <w:rPr>
-          <w:i/>
-          <w:iCs/>
-          <w:color w:val="CCCCCC"/>
-          <w:sz w:val="18"/>
-          <w:szCs w:val="18"/>
-          <w:rFonts w:ascii="Calibri" w:cs="Calibri" w:eastAsia="Calibri" w:hAnsi="Calibri"/>
-        </w:rPr>
-        <w:t xml:space="preserve">  Technologies: HTML5, CSS3, JavaScript, Node.js, Express.js, PostgreSQL, Paystack, WebSocket</w:t>
+        <w:t xml:space="preserve">• Built a Nigerian rental marketplace (web, Android, iOS) with NIN identity verification, proof-of-ownership gating, verified viewings, generated tenancy agreements and Paystack split payments, on Flask and Google Cloud</w:t>
+      </w:r>
+    </w:p>
+    <w:p>
+      <w:pPr>
+        <w:spacing w:after="50"/>
+        <w:ind w:left="360"/>
+      </w:pPr>
+      <w:r>
+        <w:rPr>
+          <w:color w:val="FFD700"/>
+          <w:sz w:val="18"/>
+          <w:szCs w:val="18"/>
+          <w:rFonts w:ascii="Calibri" w:cs="Calibri" w:eastAsia="Calibri" w:hAnsi="Calibri"/>
+        </w:rPr>
+        <w:t xml:space="preserve">  Live: https://tekvwaproperties.com/</w:t>
+      </w:r>
+    </w:p>
+    <w:p>
+      <w:pPr>
+        <w:spacing w:after="100"/>
+        <w:ind w:left="360"/>
+      </w:pPr>
+      <w:r>
+        <w:rPr>
+          <w:i/>
+          <w:iCs/>
+          <w:color w:val="CCCCCC"/>
+          <w:sz w:val="18"/>
+          <w:szCs w:val="18"/>
+          <w:rFonts w:ascii="Calibri" w:cs="Calibri" w:eastAsia="Calibri" w:hAnsi="Calibri"/>
+        </w:rPr>
+        <w:t xml:space="preserve">  Technologies: Python, Flask, PostgreSQL, SQLAlchemy, JavaScript, Capacitor (Android/iOS), Google Cloud Run, Cloud SQL, Firebase, Paystack, Dojah (NIN)</w:t>
       </w:r>
     </w:p>
     <w:p>
@@ -2189,7 +2129,7 @@
           <w:szCs w:val="22"/>
           <w:rFonts w:ascii="Calibri" w:cs="Calibri" w:eastAsia="Calibri" w:hAnsi="Calibri"/>
         </w:rPr>
-        <w:t xml:space="preserve">Online Retail SQL Analysis</w:t>
+        <w:t xml:space="preserve">VOP Trading</w:t>
       </w:r>
       <w:tab/>
       <w:r>
@@ -2201,54 +2141,54 @@
           <w:szCs w:val="20"/>
           <w:rFonts w:ascii="Calibri" w:cs="Calibri" w:eastAsia="Calibri" w:hAnsi="Calibri"/>
         </w:rPr>
-        <w:t xml:space="preserve">Jul 2026</w:t>
-      </w:r>
-    </w:p>
-    <w:p>
-      <w:pPr>
-        <w:spacing w:after="50"/>
-        <w:ind w:left="360"/>
-      </w:pPr>
-      <w:r>
-        <w:rPr>
-          <w:color w:val="FFFFFF"/>
-          <w:sz w:val="20"/>
-          <w:szCs w:val="20"/>
-          <w:rFonts w:ascii="Calibri" w:cs="Calibri" w:eastAsia="Calibri" w:hAnsi="Calibri"/>
-        </w:rPr>
-        <w:t xml:space="preserve">• Designed a normalized PostgreSQL schema and wrote 30 production SQL queries analyzing 500K+ e-commerce transactions, uncovering revenue concentration and segmentation insights while auditing and documenting real bugs in the analysis itself</w:t>
-      </w:r>
-    </w:p>
-    <w:p>
-      <w:pPr>
-        <w:spacing w:after="50"/>
-        <w:ind w:left="360"/>
-      </w:pPr>
-      <w:r>
-        <w:rPr>
-          <w:color w:val="FFD700"/>
-          <w:sz w:val="18"/>
-          <w:szCs w:val="18"/>
-          <w:rFonts w:ascii="Calibri" w:cs="Calibri" w:eastAsia="Calibri" w:hAnsi="Calibri"/>
-        </w:rPr>
-        <w:t xml:space="preserve">  GitHub: https://github.com/EfeObus/Online-Retail-SQL-Analysis</w:t>
-      </w:r>
-    </w:p>
-    <w:p>
-      <w:pPr>
-        <w:spacing w:after="100"/>
-        <w:ind w:left="360"/>
-      </w:pPr>
-      <w:r>
-        <w:rPr>
-          <w:i/>
-          <w:iCs/>
-          <w:color w:val="CCCCCC"/>
-          <w:sz w:val="18"/>
-          <w:szCs w:val="18"/>
-          <w:rFonts w:ascii="Calibri" w:cs="Calibri" w:eastAsia="Calibri" w:hAnsi="Calibri"/>
-        </w:rPr>
-        <w:t xml:space="preserve">  Technologies: PostgreSQL, SQL, Window Functions, CTEs, RFM Segmentation, Cohort Analysis, Database Design</w:t>
+        <w:t xml:space="preserve">Aug 2026</w:t>
+      </w:r>
+    </w:p>
+    <w:p>
+      <w:pPr>
+        <w:spacing w:after="50"/>
+        <w:ind w:left="360"/>
+      </w:pPr>
+      <w:r>
+        <w:rPr>
+          <w:color w:val="FFFFFF"/>
+          <w:sz w:val="20"/>
+          <w:szCs w:val="20"/>
+          <w:rFonts w:ascii="Calibri" w:cs="Calibri" w:eastAsia="Calibri" w:hAnsi="Calibri"/>
+        </w:rPr>
+        <w:t xml:space="preserve">• Integrated a stocks-and-crypto paper-trading platform: built the Next.js web app, Fastify session gateway and a REST-to-FIX adapter around open-source brokerage, FIX matching and trading-bot engines</w:t>
+      </w:r>
+    </w:p>
+    <w:p>
+      <w:pPr>
+        <w:spacing w:after="50"/>
+        <w:ind w:left="360"/>
+      </w:pPr>
+      <w:r>
+        <w:rPr>
+          <w:color w:val="FFD700"/>
+          <w:sz w:val="18"/>
+          <w:szCs w:val="18"/>
+          <w:rFonts w:ascii="Calibri" w:cs="Calibri" w:eastAsia="Calibri" w:hAnsi="Calibri"/>
+        </w:rPr>
+        <w:t xml:space="preserve">  GitHub: https://github.com/EfeObus/VopTrading</w:t>
+      </w:r>
+    </w:p>
+    <w:p>
+      <w:pPr>
+        <w:spacing w:after="100"/>
+        <w:ind w:left="360"/>
+      </w:pPr>
+      <w:r>
+        <w:rPr>
+          <w:i/>
+          <w:iCs/>
+          <w:color w:val="CCCCCC"/>
+          <w:sz w:val="18"/>
+          <w:szCs w:val="18"/>
+          <w:rFonts w:ascii="Calibri" w:cs="Calibri" w:eastAsia="Calibri" w:hAnsi="Calibri"/>
+        </w:rPr>
+        <w:t xml:space="preserve">  Technologies: Next.js, React, TypeScript, Fastify, .NET, QuickFIX/n (FIX protocol), Python, PostgreSQL, Docker</w:t>
       </w:r>
     </w:p>
     <w:p>
@@ -2267,7 +2207,7 @@
           <w:szCs w:val="22"/>
           <w:rFonts w:ascii="Calibri" w:cs="Calibri" w:eastAsia="Calibri" w:hAnsi="Calibri"/>
         </w:rPr>
-        <w:t xml:space="preserve">Nashville Housing Market Analysis</w:t>
+        <w:t xml:space="preserve">Efe Portfolio App</w:t>
       </w:r>
       <w:tab/>
       <w:r>
@@ -2279,54 +2219,54 @@
           <w:szCs w:val="20"/>
           <w:rFonts w:ascii="Calibri" w:cs="Calibri" w:eastAsia="Calibri" w:hAnsi="Calibri"/>
         </w:rPr>
-        <w:t xml:space="preserve">Jul 2026</w:t>
-      </w:r>
-    </w:p>
-    <w:p>
-      <w:pPr>
-        <w:spacing w:after="50"/>
-        <w:ind w:left="360"/>
-      </w:pPr>
-      <w:r>
-        <w:rPr>
-          <w:color w:val="FFFFFF"/>
-          <w:sz w:val="20"/>
-          <w:szCs w:val="20"/>
-          <w:rFonts w:ascii="Calibri" w:cs="Calibri" w:eastAsia="Calibri" w:hAnsi="Calibri"/>
-        </w:rPr>
-        <w:t xml:space="preserve">• Transformed 56,636 messy municipal housing records (2013-2016) into a verified $18.50B market analysis — surfacing a $327,581 average vs. $205,838 median sale price to flag outlier skew — via an Excel formula engine (VLOOKUP/XLOOKUP/SUMPRODUCT) and a 9-pivot-table KPI dashboard</w:t>
-      </w:r>
-    </w:p>
-    <w:p>
-      <w:pPr>
-        <w:spacing w:after="50"/>
-        <w:ind w:left="360"/>
-      </w:pPr>
-      <w:r>
-        <w:rPr>
-          <w:color w:val="FFD700"/>
-          <w:sz w:val="18"/>
-          <w:szCs w:val="18"/>
-          <w:rFonts w:ascii="Calibri" w:cs="Calibri" w:eastAsia="Calibri" w:hAnsi="Calibri"/>
-        </w:rPr>
-        <w:t xml:space="preserve">  GitHub: https://github.com/EfeObus/Nashville-Housing</w:t>
-      </w:r>
-    </w:p>
-    <w:p>
-      <w:pPr>
-        <w:spacing w:after="100"/>
-        <w:ind w:left="360"/>
-      </w:pPr>
-      <w:r>
-        <w:rPr>
-          <w:i/>
-          <w:iCs/>
-          <w:color w:val="CCCCCC"/>
-          <w:sz w:val="18"/>
-          <w:szCs w:val="18"/>
-          <w:rFonts w:ascii="Calibri" w:cs="Calibri" w:eastAsia="Calibri" w:hAnsi="Calibri"/>
-        </w:rPr>
-        <w:t xml:space="preserve">  Technologies: Microsoft Excel, VLOOKUP/XLOOKUP, INDEX/MATCH, Pivot Tables, SUMPRODUCT, Data Cleaning, Business Intelligence</w:t>
+        <w:t xml:space="preserve">Jul 2026 – Present</w:t>
+      </w:r>
+    </w:p>
+    <w:p>
+      <w:pPr>
+        <w:spacing w:after="50"/>
+        <w:ind w:left="360"/>
+      </w:pPr>
+      <w:r>
+        <w:rPr>
+          <w:color w:val="FFFFFF"/>
+          <w:sz w:val="20"/>
+          <w:szCs w:val="20"/>
+          <w:rFonts w:ascii="Calibri" w:cs="Calibri" w:eastAsia="Calibri" w:hAnsi="Calibri"/>
+        </w:rPr>
+        <w:t xml:space="preserve">• Built a React/TypeScript companion app for iOS and Android (Capacitor) that syncs live with this portfolio's published data, works offline, and opens role-specific resumes natively</w:t>
+      </w:r>
+    </w:p>
+    <w:p>
+      <w:pPr>
+        <w:spacing w:after="50"/>
+        <w:ind w:left="360"/>
+      </w:pPr>
+      <w:r>
+        <w:rPr>
+          <w:color w:val="FFD700"/>
+          <w:sz w:val="18"/>
+          <w:szCs w:val="18"/>
+          <w:rFonts w:ascii="Calibri" w:cs="Calibri" w:eastAsia="Calibri" w:hAnsi="Calibri"/>
+        </w:rPr>
+        <w:t xml:space="preserve">  GitHub: https://github.com/EfeObus/Efe-Obukohwo-Mobile</w:t>
+      </w:r>
+    </w:p>
+    <w:p>
+      <w:pPr>
+        <w:spacing w:after="100"/>
+        <w:ind w:left="360"/>
+      </w:pPr>
+      <w:r>
+        <w:rPr>
+          <w:i/>
+          <w:iCs/>
+          <w:color w:val="CCCCCC"/>
+          <w:sz w:val="18"/>
+          <w:szCs w:val="18"/>
+          <w:rFonts w:ascii="Calibri" w:cs="Calibri" w:eastAsia="Calibri" w:hAnsi="Calibri"/>
+        </w:rPr>
+        <w:t xml:space="preserve">  Technologies: React, TypeScript, Vite, Capacitor (Android/iOS), Capacitor Preferences, Oxlint</w:t>
       </w:r>
     </w:p>
     <w:p>
@@ -2345,7 +2285,7 @@
           <w:szCs w:val="22"/>
           <w:rFonts w:ascii="Calibri" w:cs="Calibri" w:eastAsia="Calibri" w:hAnsi="Calibri"/>
         </w:rPr>
-        <w:t xml:space="preserve">GDHO Dataset Analysis</w:t>
+        <w:t xml:space="preserve">NaijaVote (System Design)</w:t>
       </w:r>
       <w:tab/>
       <w:r>
@@ -2357,54 +2297,54 @@
           <w:szCs w:val="20"/>
           <w:rFonts w:ascii="Calibri" w:cs="Calibri" w:eastAsia="Calibri" w:hAnsi="Calibri"/>
         </w:rPr>
-        <w:t xml:space="preserve">Nov 2025</w:t>
-      </w:r>
-    </w:p>
-    <w:p>
-      <w:pPr>
-        <w:spacing w:after="50"/>
-        <w:ind w:left="360"/>
-      </w:pPr>
-      <w:r>
-        <w:rPr>
-          <w:color w:val="FFFFFF"/>
-          <w:sz w:val="20"/>
-          <w:szCs w:val="20"/>
-          <w:rFonts w:ascii="Calibri" w:cs="Calibri" w:eastAsia="Calibri" w:hAnsi="Calibri"/>
-        </w:rPr>
-        <w:t xml:space="preserve">• Cleaned and analyzed 125,125 org-year rows covering 7,301 humanitarian organizations (GDHO 2025, 2006-2024), surfacing a 6,780x median-budget gap between national NGOs and UN agencies, then built a LightGBM budget estimator (0.796 held-out R², org-grouped train/test split) with an honest audit of its own imputation limitations</w:t>
-      </w:r>
-    </w:p>
-    <w:p>
-      <w:pPr>
-        <w:spacing w:after="50"/>
-        <w:ind w:left="360"/>
-      </w:pPr>
-      <w:r>
-        <w:rPr>
-          <w:color w:val="FFD700"/>
-          <w:sz w:val="18"/>
-          <w:szCs w:val="18"/>
-          <w:rFonts w:ascii="Calibri" w:cs="Calibri" w:eastAsia="Calibri" w:hAnsi="Calibri"/>
-        </w:rPr>
-        <w:t xml:space="preserve">  GitHub: https://github.com/EfeObus/Global-Database-of-Humanitarian-Organizations-Analysis</w:t>
-      </w:r>
-    </w:p>
-    <w:p>
-      <w:pPr>
-        <w:spacing w:after="100"/>
-        <w:ind w:left="360"/>
-      </w:pPr>
-      <w:r>
-        <w:rPr>
-          <w:i/>
-          <w:iCs/>
-          <w:color w:val="CCCCCC"/>
-          <w:sz w:val="18"/>
-          <w:szCs w:val="18"/>
-          <w:rFonts w:ascii="Calibri" w:cs="Calibri" w:eastAsia="Calibri" w:hAnsi="Calibri"/>
-        </w:rPr>
-        <w:t xml:space="preserve">  Technologies: Python, Pandas, NumPy, Scikit-learn, LightGBM, Matplotlib, Feature Engineering, Data Cleaning</w:t>
+        <w:t xml:space="preserve">Jul 2026</w:t>
+      </w:r>
+    </w:p>
+    <w:p>
+      <w:pPr>
+        <w:spacing w:after="50"/>
+        <w:ind w:left="360"/>
+      </w:pPr>
+      <w:r>
+        <w:rPr>
+          <w:color w:val="FFFFFF"/>
+          <w:sz w:val="20"/>
+          <w:szCs w:val="20"/>
+          <w:rFonts w:ascii="Calibri" w:cs="Calibri" w:eastAsia="Calibri" w:hAnsi="Calibri"/>
+        </w:rPr>
+        <w:t xml:space="preserve">• Wrote a full system design for a hybrid online and polling-unit e-voting system for Nigeria, covering cryptography (mix-net, threshold HSM keys), identity, auditability and a threat model</w:t>
+      </w:r>
+    </w:p>
+    <w:p>
+      <w:pPr>
+        <w:spacing w:after="50"/>
+        <w:ind w:left="360"/>
+      </w:pPr>
+      <w:r>
+        <w:rPr>
+          <w:color w:val="FFD700"/>
+          <w:sz w:val="18"/>
+          <w:szCs w:val="18"/>
+          <w:rFonts w:ascii="Calibri" w:cs="Calibri" w:eastAsia="Calibri" w:hAnsi="Calibri"/>
+        </w:rPr>
+        <w:t xml:space="preserve">  GitHub: https://github.com/EfeObus/NaijaVote</w:t>
+      </w:r>
+    </w:p>
+    <w:p>
+      <w:pPr>
+        <w:spacing w:after="100"/>
+        <w:ind w:left="360"/>
+      </w:pPr>
+      <w:r>
+        <w:rPr>
+          <w:i/>
+          <w:iCs/>
+          <w:color w:val="CCCCCC"/>
+          <w:sz w:val="18"/>
+          <w:szCs w:val="18"/>
+          <w:rFonts w:ascii="Calibri" w:cs="Calibri" w:eastAsia="Calibri" w:hAnsi="Calibri"/>
+        </w:rPr>
+        <w:t xml:space="preserve">  Technologies: System Design, Threat Modeling, Applied Cryptography, Rust, Go, gRPC / mTLS</w:t>
       </w:r>
     </w:p>
     <w:p>
@@ -2423,7 +2363,7 @@
           <w:szCs w:val="22"/>
           <w:rFonts w:ascii="Calibri" w:cs="Calibri" w:eastAsia="Calibri" w:hAnsi="Calibri"/>
         </w:rPr>
-        <w:t xml:space="preserve">Agho Hospital Management System</w:t>
+        <w:t xml:space="preserve">Tekvwa Mortgage AI</w:t>
       </w:r>
       <w:tab/>
       <w:r>
@@ -2435,54 +2375,54 @@
           <w:szCs w:val="20"/>
           <w:rFonts w:ascii="Calibri" w:cs="Calibri" w:eastAsia="Calibri" w:hAnsi="Calibri"/>
         </w:rPr>
-        <w:t xml:space="preserve">2025</w:t>
-      </w:r>
-    </w:p>
-    <w:p>
-      <w:pPr>
-        <w:spacing w:after="50"/>
-        <w:ind w:left="360"/>
-      </w:pPr>
-      <w:r>
-        <w:rPr>
-          <w:color w:val="FFFFFF"/>
-          <w:sz w:val="20"/>
-          <w:szCs w:val="20"/>
-          <w:rFonts w:ascii="Calibri" w:cs="Calibri" w:eastAsia="Calibri" w:hAnsi="Calibri"/>
-        </w:rPr>
-        <w:t xml:space="preserve">• Built a hospital management system with role-based access control across 4 staff roles, securing patient data with SHA-256 hashing and SQL-injection prevention</w:t>
-      </w:r>
-    </w:p>
-    <w:p>
-      <w:pPr>
-        <w:spacing w:after="50"/>
-        <w:ind w:left="360"/>
-      </w:pPr>
-      <w:r>
-        <w:rPr>
-          <w:color w:val="FFD700"/>
-          <w:sz w:val="18"/>
-          <w:szCs w:val="18"/>
-          <w:rFonts w:ascii="Calibri" w:cs="Calibri" w:eastAsia="Calibri" w:hAnsi="Calibri"/>
-        </w:rPr>
-        <w:t xml:space="preserve">  GitHub: https://github.com/EfeObus/Agho-Hospital-Management</w:t>
-      </w:r>
-    </w:p>
-    <w:p>
-      <w:pPr>
-        <w:spacing w:after="100"/>
-        <w:ind w:left="360"/>
-      </w:pPr>
-      <w:r>
-        <w:rPr>
-          <w:i/>
-          <w:iCs/>
-          <w:color w:val="CCCCCC"/>
-          <w:sz w:val="18"/>
-          <w:szCs w:val="18"/>
-          <w:rFonts w:ascii="Calibri" w:cs="Calibri" w:eastAsia="Calibri" w:hAnsi="Calibri"/>
-        </w:rPr>
-        <w:t xml:space="preserve">  Technologies: Java, Java Swing, PostgreSQL, JDBC, SHA-256, Web Server</w:t>
+        <w:t xml:space="preserve">Mar 2026</w:t>
+      </w:r>
+    </w:p>
+    <w:p>
+      <w:pPr>
+        <w:spacing w:after="50"/>
+        <w:ind w:left="360"/>
+      </w:pPr>
+      <w:r>
+        <w:rPr>
+          <w:color w:val="FFFFFF"/>
+          <w:sz w:val="20"/>
+          <w:szCs w:val="20"/>
+          <w:rFonts w:ascii="Calibri" w:cs="Calibri" w:eastAsia="Calibri" w:hAnsi="Calibri"/>
+        </w:rPr>
+        <w:t xml:space="preserve">• Built a FastAPI mortgage risk platform on Freddie Mac loan data with multi-target default models, SHAP explanations, OSFI B-20 stress testing, Fairlearn bias checks and portfolio risk metrics</w:t>
+      </w:r>
+    </w:p>
+    <w:p>
+      <w:pPr>
+        <w:spacing w:after="50"/>
+        <w:ind w:left="360"/>
+      </w:pPr>
+      <w:r>
+        <w:rPr>
+          <w:color w:val="FFD700"/>
+          <w:sz w:val="18"/>
+          <w:szCs w:val="18"/>
+          <w:rFonts w:ascii="Calibri" w:cs="Calibri" w:eastAsia="Calibri" w:hAnsi="Calibri"/>
+        </w:rPr>
+        <w:t xml:space="preserve">  GitHub: https://github.com/EfeObus/Tekvwa-Mortgage-AI</w:t>
+      </w:r>
+    </w:p>
+    <w:p>
+      <w:pPr>
+        <w:spacing w:after="100"/>
+        <w:ind w:left="360"/>
+      </w:pPr>
+      <w:r>
+        <w:rPr>
+          <w:i/>
+          <w:iCs/>
+          <w:color w:val="CCCCCC"/>
+          <w:sz w:val="18"/>
+          <w:szCs w:val="18"/>
+          <w:rFonts w:ascii="Calibri" w:cs="Calibri" w:eastAsia="Calibri" w:hAnsi="Calibri"/>
+        </w:rPr>
+        <w:t xml:space="preserve">  Technologies: Python, FastAPI, PostgreSQL, LightGBM, XGBoost, scikit-learn, SHAP, Fairlearn</w:t>
       </w:r>
     </w:p>
     <w:p>
@@ -2501,6 +2441,396 @@
           <w:szCs w:val="22"/>
           <w:rFonts w:ascii="Calibri" w:cs="Calibri" w:eastAsia="Calibri" w:hAnsi="Calibri"/>
         </w:rPr>
+        <w:t xml:space="preserve">Tekvwa IT Solutions Website</w:t>
+      </w:r>
+      <w:tab/>
+      <w:r>
+        <w:rPr>
+          <w:i/>
+          <w:iCs/>
+          <w:color w:val="CCCCCC"/>
+          <w:sz w:val="20"/>
+          <w:szCs w:val="20"/>
+          <w:rFonts w:ascii="Calibri" w:cs="Calibri" w:eastAsia="Calibri" w:hAnsi="Calibri"/>
+        </w:rPr>
+        <w:t xml:space="preserve">Jan 2026 – Present</w:t>
+      </w:r>
+    </w:p>
+    <w:p>
+      <w:pPr>
+        <w:spacing w:after="50"/>
+        <w:ind w:left="360"/>
+      </w:pPr>
+      <w:r>
+        <w:rPr>
+          <w:color w:val="FFFFFF"/>
+          <w:sz w:val="20"/>
+          <w:szCs w:val="20"/>
+          <w:rFonts w:ascii="Calibri" w:cs="Calibri" w:eastAsia="Calibri" w:hAnsi="Calibri"/>
+        </w:rPr>
+        <w:t xml:space="preserve">• Built my company's website and internal operations platform: live chat, consultation booking, staff and payroll management, helpdesk, compliance tracking and audit logs on Node.js and PostgreSQL</w:t>
+      </w:r>
+    </w:p>
+    <w:p>
+      <w:pPr>
+        <w:spacing w:after="50"/>
+        <w:ind w:left="360"/>
+      </w:pPr>
+      <w:r>
+        <w:rPr>
+          <w:color w:val="FFD700"/>
+          <w:sz w:val="18"/>
+          <w:szCs w:val="18"/>
+          <w:rFonts w:ascii="Calibri" w:cs="Calibri" w:eastAsia="Calibri" w:hAnsi="Calibri"/>
+        </w:rPr>
+        <w:t xml:space="preserve">  GitHub: https://github.com/EfeObus/Tekvwarho-IT-Solutions-Ltd</w:t>
+      </w:r>
+    </w:p>
+    <w:p>
+      <w:pPr>
+        <w:spacing w:after="100"/>
+        <w:ind w:left="360"/>
+      </w:pPr>
+      <w:r>
+        <w:rPr>
+          <w:i/>
+          <w:iCs/>
+          <w:color w:val="CCCCCC"/>
+          <w:sz w:val="18"/>
+          <w:szCs w:val="18"/>
+          <w:rFonts w:ascii="Calibri" w:cs="Calibri" w:eastAsia="Calibri" w:hAnsi="Calibri"/>
+        </w:rPr>
+        <w:t xml:space="preserve">  Technologies: Node.js, Express.js, PostgreSQL, WebSocket, JavaScript, JWT, Docker, Google Cloud Storage</w:t>
+      </w:r>
+    </w:p>
+    <w:p>
+      <w:pPr>
+        <w:tabs>
+          <w:tab w:val="right" w:pos="10800"/>
+        </w:tabs>
+        <w:spacing w:before="150" w:after="20"/>
+      </w:pPr>
+      <w:r>
+        <w:rPr>
+          <w:b/>
+          <w:bCs/>
+          <w:color w:val="FFFFFF"/>
+          <w:sz w:val="22"/>
+          <w:szCs w:val="22"/>
+          <w:rFonts w:ascii="Calibri" w:cs="Calibri" w:eastAsia="Calibri" w:hAnsi="Calibri"/>
+        </w:rPr>
+        <w:t xml:space="preserve">Online Retail SQL Analysis</w:t>
+      </w:r>
+      <w:tab/>
+      <w:r>
+        <w:rPr>
+          <w:i/>
+          <w:iCs/>
+          <w:color w:val="CCCCCC"/>
+          <w:sz w:val="20"/>
+          <w:szCs w:val="20"/>
+          <w:rFonts w:ascii="Calibri" w:cs="Calibri" w:eastAsia="Calibri" w:hAnsi="Calibri"/>
+        </w:rPr>
+        <w:t xml:space="preserve">Jul 2026</w:t>
+      </w:r>
+    </w:p>
+    <w:p>
+      <w:pPr>
+        <w:spacing w:after="50"/>
+        <w:ind w:left="360"/>
+      </w:pPr>
+      <w:r>
+        <w:rPr>
+          <w:color w:val="FFFFFF"/>
+          <w:sz w:val="20"/>
+          <w:szCs w:val="20"/>
+          <w:rFonts w:ascii="Calibri" w:cs="Calibri" w:eastAsia="Calibri" w:hAnsi="Calibri"/>
+        </w:rPr>
+        <w:t xml:space="preserve">• Designed a normalized PostgreSQL schema and wrote 30 production SQL queries analyzing 500K+ e-commerce transactions, uncovering revenue concentration and segmentation insights while auditing and documenting real bugs in the analysis itself</w:t>
+      </w:r>
+    </w:p>
+    <w:p>
+      <w:pPr>
+        <w:spacing w:after="50"/>
+        <w:ind w:left="360"/>
+      </w:pPr>
+      <w:r>
+        <w:rPr>
+          <w:color w:val="FFD700"/>
+          <w:sz w:val="18"/>
+          <w:szCs w:val="18"/>
+          <w:rFonts w:ascii="Calibri" w:cs="Calibri" w:eastAsia="Calibri" w:hAnsi="Calibri"/>
+        </w:rPr>
+        <w:t xml:space="preserve">  GitHub: https://github.com/EfeObus/Online-Retail-SQL-Analysis</w:t>
+      </w:r>
+    </w:p>
+    <w:p>
+      <w:pPr>
+        <w:spacing w:after="100"/>
+        <w:ind w:left="360"/>
+      </w:pPr>
+      <w:r>
+        <w:rPr>
+          <w:i/>
+          <w:iCs/>
+          <w:color w:val="CCCCCC"/>
+          <w:sz w:val="18"/>
+          <w:szCs w:val="18"/>
+          <w:rFonts w:ascii="Calibri" w:cs="Calibri" w:eastAsia="Calibri" w:hAnsi="Calibri"/>
+        </w:rPr>
+        <w:t xml:space="preserve">  Technologies: PostgreSQL, SQL, Window Functions, CTEs, RFM Segmentation, Cohort Analysis, Database Design</w:t>
+      </w:r>
+    </w:p>
+    <w:p>
+      <w:pPr>
+        <w:tabs>
+          <w:tab w:val="right" w:pos="10800"/>
+        </w:tabs>
+        <w:spacing w:before="150" w:after="20"/>
+      </w:pPr>
+      <w:r>
+        <w:rPr>
+          <w:b/>
+          <w:bCs/>
+          <w:color w:val="FFFFFF"/>
+          <w:sz w:val="22"/>
+          <w:szCs w:val="22"/>
+          <w:rFonts w:ascii="Calibri" w:cs="Calibri" w:eastAsia="Calibri" w:hAnsi="Calibri"/>
+        </w:rPr>
+        <w:t xml:space="preserve">Nashville Housing Market Analysis</w:t>
+      </w:r>
+      <w:tab/>
+      <w:r>
+        <w:rPr>
+          <w:i/>
+          <w:iCs/>
+          <w:color w:val="CCCCCC"/>
+          <w:sz w:val="20"/>
+          <w:szCs w:val="20"/>
+          <w:rFonts w:ascii="Calibri" w:cs="Calibri" w:eastAsia="Calibri" w:hAnsi="Calibri"/>
+        </w:rPr>
+        <w:t xml:space="preserve">Jul 2026</w:t>
+      </w:r>
+    </w:p>
+    <w:p>
+      <w:pPr>
+        <w:spacing w:after="50"/>
+        <w:ind w:left="360"/>
+      </w:pPr>
+      <w:r>
+        <w:rPr>
+          <w:color w:val="FFFFFF"/>
+          <w:sz w:val="20"/>
+          <w:szCs w:val="20"/>
+          <w:rFonts w:ascii="Calibri" w:cs="Calibri" w:eastAsia="Calibri" w:hAnsi="Calibri"/>
+        </w:rPr>
+        <w:t xml:space="preserve">• Transformed 56,636 messy municipal housing records (2013-2016) into a verified $18.50B market analysis — surfacing a $327,581 average vs. $205,838 median sale price to flag outlier skew — via an Excel formula engine (VLOOKUP/XLOOKUP/SUMPRODUCT) and a 9-pivot-table KPI dashboard</w:t>
+      </w:r>
+    </w:p>
+    <w:p>
+      <w:pPr>
+        <w:spacing w:after="50"/>
+        <w:ind w:left="360"/>
+      </w:pPr>
+      <w:r>
+        <w:rPr>
+          <w:color w:val="FFD700"/>
+          <w:sz w:val="18"/>
+          <w:szCs w:val="18"/>
+          <w:rFonts w:ascii="Calibri" w:cs="Calibri" w:eastAsia="Calibri" w:hAnsi="Calibri"/>
+        </w:rPr>
+        <w:t xml:space="preserve">  GitHub: https://github.com/EfeObus/Nashville-Housing</w:t>
+      </w:r>
+    </w:p>
+    <w:p>
+      <w:pPr>
+        <w:spacing w:after="100"/>
+        <w:ind w:left="360"/>
+      </w:pPr>
+      <w:r>
+        <w:rPr>
+          <w:i/>
+          <w:iCs/>
+          <w:color w:val="CCCCCC"/>
+          <w:sz w:val="18"/>
+          <w:szCs w:val="18"/>
+          <w:rFonts w:ascii="Calibri" w:cs="Calibri" w:eastAsia="Calibri" w:hAnsi="Calibri"/>
+        </w:rPr>
+        <w:t xml:space="preserve">  Technologies: Microsoft Excel, VLOOKUP/XLOOKUP, INDEX/MATCH, Pivot Tables, SUMPRODUCT, Data Cleaning, Business Intelligence</w:t>
+      </w:r>
+    </w:p>
+    <w:p>
+      <w:pPr>
+        <w:tabs>
+          <w:tab w:val="right" w:pos="10800"/>
+        </w:tabs>
+        <w:spacing w:before="150" w:after="20"/>
+      </w:pPr>
+      <w:r>
+        <w:rPr>
+          <w:b/>
+          <w:bCs/>
+          <w:color w:val="FFFFFF"/>
+          <w:sz w:val="22"/>
+          <w:szCs w:val="22"/>
+          <w:rFonts w:ascii="Calibri" w:cs="Calibri" w:eastAsia="Calibri" w:hAnsi="Calibri"/>
+        </w:rPr>
+        <w:t xml:space="preserve">GDHO Dataset Analysis</w:t>
+      </w:r>
+      <w:tab/>
+      <w:r>
+        <w:rPr>
+          <w:i/>
+          <w:iCs/>
+          <w:color w:val="CCCCCC"/>
+          <w:sz w:val="20"/>
+          <w:szCs w:val="20"/>
+          <w:rFonts w:ascii="Calibri" w:cs="Calibri" w:eastAsia="Calibri" w:hAnsi="Calibri"/>
+        </w:rPr>
+        <w:t xml:space="preserve">Nov 2025</w:t>
+      </w:r>
+    </w:p>
+    <w:p>
+      <w:pPr>
+        <w:spacing w:after="50"/>
+        <w:ind w:left="360"/>
+      </w:pPr>
+      <w:r>
+        <w:rPr>
+          <w:color w:val="FFFFFF"/>
+          <w:sz w:val="20"/>
+          <w:szCs w:val="20"/>
+          <w:rFonts w:ascii="Calibri" w:cs="Calibri" w:eastAsia="Calibri" w:hAnsi="Calibri"/>
+        </w:rPr>
+        <w:t xml:space="preserve">• Cleaned and analyzed 125,125 org-year rows covering 7,301 humanitarian organizations (GDHO 2025, 2006-2024), surfacing a 6,780x median-budget gap between national NGOs and UN agencies, then built a LightGBM budget estimator (0.796 held-out R², org-grouped train/test split) with an honest audit of its own imputation limitations</w:t>
+      </w:r>
+    </w:p>
+    <w:p>
+      <w:pPr>
+        <w:spacing w:after="50"/>
+        <w:ind w:left="360"/>
+      </w:pPr>
+      <w:r>
+        <w:rPr>
+          <w:color w:val="FFD700"/>
+          <w:sz w:val="18"/>
+          <w:szCs w:val="18"/>
+          <w:rFonts w:ascii="Calibri" w:cs="Calibri" w:eastAsia="Calibri" w:hAnsi="Calibri"/>
+        </w:rPr>
+        <w:t xml:space="preserve">  GitHub: https://github.com/EfeObus/Global-Database-of-Humanitarian-Organizations-Analysis</w:t>
+      </w:r>
+    </w:p>
+    <w:p>
+      <w:pPr>
+        <w:spacing w:after="100"/>
+        <w:ind w:left="360"/>
+      </w:pPr>
+      <w:r>
+        <w:rPr>
+          <w:i/>
+          <w:iCs/>
+          <w:color w:val="CCCCCC"/>
+          <w:sz w:val="18"/>
+          <w:szCs w:val="18"/>
+          <w:rFonts w:ascii="Calibri" w:cs="Calibri" w:eastAsia="Calibri" w:hAnsi="Calibri"/>
+        </w:rPr>
+        <w:t xml:space="preserve">  Technologies: Python, Pandas, NumPy, Scikit-learn, LightGBM, Matplotlib, Feature Engineering, Data Cleaning</w:t>
+      </w:r>
+    </w:p>
+    <w:p>
+      <w:pPr>
+        <w:tabs>
+          <w:tab w:val="right" w:pos="10800"/>
+        </w:tabs>
+        <w:spacing w:before="150" w:after="20"/>
+      </w:pPr>
+      <w:r>
+        <w:rPr>
+          <w:b/>
+          <w:bCs/>
+          <w:color w:val="FFFFFF"/>
+          <w:sz w:val="22"/>
+          <w:szCs w:val="22"/>
+          <w:rFonts w:ascii="Calibri" w:cs="Calibri" w:eastAsia="Calibri" w:hAnsi="Calibri"/>
+        </w:rPr>
+        <w:t xml:space="preserve">Agho Hospital Management System</w:t>
+      </w:r>
+      <w:tab/>
+      <w:r>
+        <w:rPr>
+          <w:i/>
+          <w:iCs/>
+          <w:color w:val="CCCCCC"/>
+          <w:sz w:val="20"/>
+          <w:szCs w:val="20"/>
+          <w:rFonts w:ascii="Calibri" w:cs="Calibri" w:eastAsia="Calibri" w:hAnsi="Calibri"/>
+        </w:rPr>
+        <w:t xml:space="preserve">2025</w:t>
+      </w:r>
+    </w:p>
+    <w:p>
+      <w:pPr>
+        <w:spacing w:after="50"/>
+        <w:ind w:left="360"/>
+      </w:pPr>
+      <w:r>
+        <w:rPr>
+          <w:color w:val="FFFFFF"/>
+          <w:sz w:val="20"/>
+          <w:szCs w:val="20"/>
+          <w:rFonts w:ascii="Calibri" w:cs="Calibri" w:eastAsia="Calibri" w:hAnsi="Calibri"/>
+        </w:rPr>
+        <w:t xml:space="preserve">• Built a hospital management system with role-based access control across 4 staff roles, securing patient data with SHA-256 hashing and SQL-injection prevention</w:t>
+      </w:r>
+    </w:p>
+    <w:p>
+      <w:pPr>
+        <w:spacing w:after="50"/>
+        <w:ind w:left="360"/>
+      </w:pPr>
+      <w:r>
+        <w:rPr>
+          <w:color w:val="FFD700"/>
+          <w:sz w:val="18"/>
+          <w:szCs w:val="18"/>
+          <w:rFonts w:ascii="Calibri" w:cs="Calibri" w:eastAsia="Calibri" w:hAnsi="Calibri"/>
+        </w:rPr>
+        <w:t xml:space="preserve">  GitHub: https://github.com/EfeObus/Agho-Hospital-Management</w:t>
+      </w:r>
+    </w:p>
+    <w:p>
+      <w:pPr>
+        <w:spacing w:after="100"/>
+        <w:ind w:left="360"/>
+      </w:pPr>
+      <w:r>
+        <w:rPr>
+          <w:i/>
+          <w:iCs/>
+          <w:color w:val="CCCCCC"/>
+          <w:sz w:val="18"/>
+          <w:szCs w:val="18"/>
+          <w:rFonts w:ascii="Calibri" w:cs="Calibri" w:eastAsia="Calibri" w:hAnsi="Calibri"/>
+        </w:rPr>
+        <w:t xml:space="preserve">  Technologies: Java, Java Swing, PostgreSQL, JDBC, SHA-256, Web Server</w:t>
+      </w:r>
+    </w:p>
+    <w:p>
+      <w:pPr>
+        <w:tabs>
+          <w:tab w:val="right" w:pos="10800"/>
+        </w:tabs>
+        <w:spacing w:before="150" w:after="20"/>
+      </w:pPr>
+      <w:r>
+        <w:rPr>
+          <w:b/>
+          <w:bCs/>
+          <w:color w:val="FFFFFF"/>
+          <w:sz w:val="22"/>
+          <w:szCs w:val="22"/>
+          <w:rFonts w:ascii="Calibri" w:cs="Calibri" w:eastAsia="Calibri" w:hAnsi="Calibri"/>
+        </w:rPr>
         <w:t xml:space="preserve">Zodiac Real Estate AI</w:t>
       </w:r>
       <w:tab/>
@@ -2529,21 +2859,6 @@
           <w:rFonts w:ascii="Calibri" w:cs="Calibri" w:eastAsia="Calibri" w:hAnsi="Calibri"/>
         </w:rPr>
         <w:t xml:space="preserve">• Delivered a real estate analytics platform achieving 88.3% ML prediction accuracy across 49,551+ Canadian properties, integrating real-time economic data feeds</w:t>
-      </w:r>
-    </w:p>
-    <w:p>
-      <w:pPr>
-        <w:spacing w:after="50"/>
-        <w:ind w:left="360"/>
-      </w:pPr>
-      <w:r>
-        <w:rPr>
-          <w:color w:val="FFD700"/>
-          <w:sz w:val="18"/>
-          <w:szCs w:val="18"/>
-          <w:rFonts w:ascii="Calibri" w:cs="Calibri" w:eastAsia="Calibri" w:hAnsi="Calibri"/>
-        </w:rPr>
-        <w:t xml:space="preserve">  GitHub: https://github.com/EfeObus/NextProperty</w:t>
       </w:r>
     </w:p>
     <w:p>

</xml_diff>